<commit_message>
vault backup: 2026-09-30 19:37:44
</commit_message>
<xml_diff>
--- a/Übergabe KJF 1.docx
+++ b/Übergabe KJF 1.docx
@@ -1,18 +1,14 @@
 
 <file path=word/document.xml><?xml version="1.0" encoding="utf-8"?>
-<w:document xmlns:w="http://schemas.openxmlformats.org/wordprocessingml/2006/main" xmlns:wp="http://schemas.openxmlformats.org/drawingml/2006/wordprocessingDrawing" xmlns:r="http://schemas.openxmlformats.org/officeDocument/2006/relationships" xmlns:v="urn:schemas-microsoft-com:vml" xmlns:w10="urn:schemas-microsoft-com:office:word" xmlns:o="urn:schemas-microsoft-com:office:office" xmlns:wp14="http://schemas.microsoft.com/office/word/2010/wordprocessingDrawing" xmlns:w14="http://schemas.microsoft.com/office/word/2010/wordml" xmlns:mc="http://schemas.openxmlformats.org/markup-compatibility/2006" xmlns:m="http://schemas.openxmlformats.org/officeDocument/2006/math" xmlns:wps="http://schemas.microsoft.com/office/word/2010/wordprocessingShape" xmlns:wpg="http://schemas.microsoft.com/office/word/2010/wordprocessingGroup" xmlns:wpi="http://schemas.microsoft.com/office/word/2010/wordprocessingInk" xmlns:wpc="http://schemas.microsoft.com/office/word/2010/wordprocessingCanvas" xmlns:wpsCustomData="http://www.wps.cn/officeDocument/2013/wpsCustomData" mc:Ignorable="w14 wp14">
+<w:document xmlns:wpc="http://schemas.microsoft.com/office/word/2010/wordprocessingCanvas" xmlns:cx="http://schemas.microsoft.com/office/drawing/2014/chartex" xmlns:cx1="http://schemas.microsoft.com/office/drawing/2015/9/8/chartex" xmlns:cx2="http://schemas.microsoft.com/office/drawing/2015/10/21/chartex" xmlns:cx3="http://schemas.microsoft.com/office/drawing/2016/5/9/chartex" xmlns:cx4="http://schemas.microsoft.com/office/drawing/2016/5/10/chartex" xmlns:cx5="http://schemas.microsoft.com/office/drawing/2016/5/11/chartex" xmlns:cx6="http://schemas.microsoft.com/office/drawing/2016/5/12/chartex" xmlns:cx7="http://schemas.microsoft.com/office/drawing/2016/5/13/chartex" xmlns:cx8="http://schemas.microsoft.com/office/drawing/2016/5/14/chartex" xmlns:mc="http://schemas.openxmlformats.org/markup-compatibility/2006" xmlns:aink="http://schemas.microsoft.com/office/drawing/2016/ink" xmlns:am3d="http://schemas.microsoft.com/office/drawing/2017/model3d" xmlns:o="urn:schemas-microsoft-com:office:office" xmlns:oel="http://schemas.microsoft.com/office/2019/extlst" xmlns:r="http://schemas.openxmlformats.org/officeDocument/2006/relationships" xmlns:m="http://schemas.openxmlformats.org/officeDocument/2006/math" xmlns:v="urn:schemas-microsoft-com:vml" xmlns:wp14="http://schemas.microsoft.com/office/word/2010/wordprocessingDrawing" xmlns:wp="http://schemas.openxmlformats.org/drawingml/2006/wordprocessingDrawing" xmlns:w10="urn:schemas-microsoft-com:office:word" xmlns:w="http://schemas.openxmlformats.org/wordprocessingml/2006/main" xmlns:w14="http://schemas.microsoft.com/office/word/2010/wordml" xmlns:w15="http://schemas.microsoft.com/office/word/2012/wordml" xmlns:w16cex="http://schemas.microsoft.com/office/word/2018/wordml/cex" xmlns:w16cid="http://schemas.microsoft.com/office/word/2016/wordml/cid" xmlns:w16="http://schemas.microsoft.com/office/word/2018/wordml" xmlns:w16du="http://schemas.microsoft.com/office/word/2023/wordml/word16du" xmlns:w16sdtdh="http://schemas.microsoft.com/office/word/2020/wordml/sdtdatahash" xmlns:w16sdtfl="http://schemas.microsoft.com/office/word/2024/wordml/sdtformatlock" xmlns:w16se="http://schemas.microsoft.com/office/word/2015/wordml/symex" xmlns:wpg="http://schemas.microsoft.com/office/word/2010/wordprocessingGroup" xmlns:wpi="http://schemas.microsoft.com/office/word/2010/wordprocessingInk" xmlns:wne="http://schemas.microsoft.com/office/word/2006/wordml" xmlns:wps="http://schemas.microsoft.com/office/word/2010/wordprocessingShape" mc:Ignorable="w14 w15 w16se w16cid w16 w16cex w16sdtdh w16sdtfl w16du wp14">
   <w:body>
     <w:p>
       <w:pPr>
-        <w:pStyle w:val="style0"/>
         <w:rPr>
           <w:b/>
           <w:bCs/>
-          <w:lang w:val="en-US"/>
-        </w:rPr>
-      </w:pPr>
-      <w:bookmarkStart w:id="0" w:name="_GoBack"/>
-      <w:bookmarkEnd w:id="0"/>
+        </w:rPr>
+      </w:pPr>
       <w:r>
         <w:rPr>
           <w:b/>
@@ -25,81 +21,86 @@
         <w:rPr>
           <w:b/>
           <w:bCs/>
-          <w:lang w:val="en-US"/>
         </w:rPr>
         <w:t>Kreisjugendleitung</w:t>
       </w:r>
     </w:p>
-    <w:p>
-      <w:pPr>
-        <w:pStyle w:val="style0"/>
-        <w:rPr/>
-      </w:pPr>
-    </w:p>
-    <w:p>
-      <w:pPr>
-        <w:pStyle w:val="style0"/>
-        <w:rPr>
-          <w:lang w:val="en-US"/>
-        </w:rPr>
-      </w:pPr>
-      <w:r>
-        <w:rPr>
-          <w:lang w:val="en-US"/>
-        </w:rPr>
+    <w:p/>
+    <w:p>
+      <w:r>
         <w:t>Aktuelles:</w:t>
       </w:r>
     </w:p>
-    <w:p>
-      <w:pPr>
-        <w:pStyle w:val="style0"/>
-        <w:rPr/>
-      </w:pPr>
-    </w:p>
-    <w:p>
-      <w:pPr>
-        <w:pStyle w:val="style179"/>
+    <w:p/>
+    <w:p>
+      <w:pPr>
+        <w:pStyle w:val="Listenabsatz"/>
         <w:numPr>
           <w:ilvl w:val="0"/>
           <w:numId w:val="1"/>
         </w:numPr>
-        <w:rPr/>
-      </w:pPr>
-      <w:r>
-        <w:rPr>
-          <w:lang w:val="en-US"/>
+        <w:rPr>
+          <w:lang w:val="de-DE"/>
+        </w:rPr>
+      </w:pPr>
+      <w:r>
+        <w:rPr>
+          <w:lang w:val="de-DE"/>
         </w:rPr>
         <w:t>Ehrungstermin 30.10. Tobias Lohrum beim Ehrungsabend der FF Mudau (Kreisehrung)</w:t>
       </w:r>
     </w:p>
     <w:p>
       <w:pPr>
-        <w:pStyle w:val="style179"/>
+        <w:pStyle w:val="Listenabsatz"/>
         <w:numPr>
           <w:ilvl w:val="0"/>
           <w:numId w:val="1"/>
         </w:numPr>
-        <w:rPr/>
-      </w:pPr>
-      <w:r>
-        <w:rPr>
-          <w:lang w:val="en-US"/>
+        <w:rPr>
+          <w:lang w:val="de-DE"/>
+        </w:rPr>
+      </w:pPr>
+      <w:r>
+        <w:rPr>
+          <w:lang w:val="de-DE"/>
         </w:rPr>
         <w:t>Ehrung Robin, Leo &amp; Tine nachholen</w:t>
       </w:r>
-    </w:p>
-    <w:p>
-      <w:pPr>
-        <w:pStyle w:val="style179"/>
+      <w:r>
+        <w:rPr>
+          <w:lang w:val="de-DE"/>
+        </w:rPr>
+        <w:t xml:space="preserve"> </w:t>
+      </w:r>
+      <w:r>
+        <w:rPr>
+          <w:lang w:val="de-DE"/>
+        </w:rPr>
+        <w:t xml:space="preserve">-&gt; </w:t>
+      </w:r>
+      <w:r>
+        <w:rPr>
+          <w:highlight w:val="yellow"/>
+          <w:lang w:val="de-DE"/>
+        </w:rPr>
+        <w:t>Zeltlager oder Versammlung</w:t>
+      </w:r>
+    </w:p>
+    <w:p>
+      <w:pPr>
+        <w:pStyle w:val="Listenabsatz"/>
         <w:numPr>
           <w:ilvl w:val="0"/>
           <w:numId w:val="1"/>
         </w:numPr>
-        <w:rPr/>
-      </w:pPr>
-      <w:r>
-        <w:rPr>
-          <w:lang w:val="en-US"/>
+        <w:rPr>
+          <w:lang w:val="de-DE"/>
+        </w:rPr>
+      </w:pPr>
+      <w:r>
+        <w:rPr>
+          <w:lang w:val="de-DE"/>
         </w:rPr>
         <w:t>Zeltlager kl</w:t>
       </w:r>
@@ -111,23 +112,38 @@
       </w:r>
       <w:r>
         <w:rPr>
-          <w:lang w:val="en-US"/>
+          <w:lang w:val="de-DE"/>
         </w:rPr>
         <w:t>ren (Zustimmung Spielerausschuss Sportverein Krumbach sowie Termin 9.-11.7. stehen noch aus)</w:t>
       </w:r>
-    </w:p>
-    <w:p>
-      <w:pPr>
-        <w:pStyle w:val="style179"/>
+      <w:r>
+        <w:rPr>
+          <w:lang w:val="de-DE"/>
+        </w:rPr>
+        <w:t xml:space="preserve"> -&gt; </w:t>
+      </w:r>
+      <w:r>
+        <w:rPr>
+          <w:highlight w:val="yellow"/>
+          <w:lang w:val="de-DE"/>
+        </w:rPr>
+        <w:t>Kontakt?</w:t>
+      </w:r>
+    </w:p>
+    <w:p>
+      <w:pPr>
+        <w:pStyle w:val="Listenabsatz"/>
         <w:numPr>
           <w:ilvl w:val="0"/>
           <w:numId w:val="1"/>
         </w:numPr>
-        <w:rPr/>
-      </w:pPr>
-      <w:r>
-        <w:rPr>
-          <w:lang w:val="en-US"/>
+        <w:rPr>
+          <w:lang w:val="de-DE"/>
+        </w:rPr>
+      </w:pPr>
+      <w:r>
+        <w:rPr>
+          <w:lang w:val="de-DE"/>
         </w:rPr>
         <w:t>Verbandsausschuss KFV muss die Wahl der neuen Kreisjugendleitung noch best</w:t>
       </w:r>
@@ -139,23 +155,25 @@
       </w:r>
       <w:r>
         <w:rPr>
-          <w:lang w:val="en-US"/>
+          <w:lang w:val="de-DE"/>
         </w:rPr>
         <w:t>tigen</w:t>
       </w:r>
     </w:p>
     <w:p>
       <w:pPr>
-        <w:pStyle w:val="style179"/>
+        <w:pStyle w:val="Listenabsatz"/>
         <w:numPr>
           <w:ilvl w:val="0"/>
           <w:numId w:val="1"/>
         </w:numPr>
-        <w:rPr/>
-      </w:pPr>
-      <w:r>
-        <w:rPr>
-          <w:lang w:val="en-US"/>
+        <w:rPr>
+          <w:lang w:val="de-DE"/>
+        </w:rPr>
+      </w:pPr>
+      <w:r>
+        <w:rPr>
+          <w:lang w:val="de-DE"/>
         </w:rPr>
         <w:t>Satzungs</w:t>
       </w:r>
@@ -167,7 +185,7 @@
       </w:r>
       <w:r>
         <w:rPr>
-          <w:lang w:val="en-US"/>
+          <w:lang w:val="de-DE"/>
         </w:rPr>
         <w:t>nderung (2 Stellvertreter) im Jahr 2027 bei der n</w:t>
       </w:r>
@@ -179,80 +197,51 @@
       </w:r>
       <w:r>
         <w:rPr>
-          <w:lang w:val="en-US"/>
+          <w:lang w:val="de-DE"/>
         </w:rPr>
         <w:t>chsten Delegiertenversammlung</w:t>
       </w:r>
     </w:p>
     <w:p>
       <w:pPr>
-        <w:pStyle w:val="style179"/>
-        <w:numPr>
-          <w:ilvl w:val="0"/>
-          <w:numId w:val="0"/>
-        </w:numPr>
-        <w:ind w:left="720" w:firstLine="0"/>
-        <w:rPr/>
-      </w:pPr>
-    </w:p>
-    <w:p>
-      <w:pPr>
-        <w:pStyle w:val="style0"/>
-        <w:numPr>
-          <w:ilvl w:val="0"/>
-          <w:numId w:val="0"/>
-        </w:numPr>
-        <w:rPr>
-          <w:lang w:val="en-US"/>
-        </w:rPr>
-      </w:pPr>
-      <w:r>
-        <w:rPr>
-          <w:lang w:val="en-US"/>
-        </w:rPr>
+        <w:pStyle w:val="Listenabsatz"/>
+        <w:rPr>
+          <w:lang w:val="de-DE"/>
+        </w:rPr>
+      </w:pPr>
+    </w:p>
+    <w:p>
+      <w:r>
         <w:t xml:space="preserve">Generell zu erledigen: </w:t>
       </w:r>
     </w:p>
-    <w:p>
-      <w:pPr>
-        <w:pStyle w:val="style0"/>
-        <w:numPr>
-          <w:ilvl w:val="0"/>
-          <w:numId w:val="0"/>
-        </w:numPr>
-        <w:rPr>
-          <w:lang w:val="en-US"/>
-        </w:rPr>
-      </w:pPr>
-    </w:p>
-    <w:p>
-      <w:pPr>
-        <w:pStyle w:val="style179"/>
+    <w:p/>
+    <w:p>
+      <w:pPr>
+        <w:pStyle w:val="Listenabsatz"/>
         <w:numPr>
           <w:ilvl w:val="0"/>
           <w:numId w:val="2"/>
         </w:numPr>
-        <w:rPr/>
-      </w:pPr>
-      <w:r>
-        <w:rPr>
-          <w:lang w:val="en-US"/>
-        </w:rPr>
+      </w:pPr>
+      <w:r>
         <w:t xml:space="preserve">Jahresbericht an Verbandsversammlung Kreisfeuerwehrverband </w:t>
       </w:r>
     </w:p>
     <w:p>
       <w:pPr>
-        <w:pStyle w:val="style179"/>
+        <w:pStyle w:val="Listenabsatz"/>
         <w:numPr>
           <w:ilvl w:val="0"/>
           <w:numId w:val="2"/>
         </w:numPr>
-        <w:rPr/>
-      </w:pPr>
-      <w:r>
-        <w:rPr>
-          <w:lang w:val="en-US"/>
+        <w:rPr>
+          <w:lang w:val="de-DE"/>
+        </w:rPr>
+      </w:pPr>
+      <w:r>
+        <w:rPr>
+          <w:lang w:val="de-DE"/>
         </w:rPr>
         <w:t>Mitgliedermeldung und Jahresbericht an Kreisjugendring (f</w:t>
       </w:r>
@@ -264,71 +253,67 @@
       </w:r>
       <w:r>
         <w:rPr>
-          <w:lang w:val="en-US"/>
+          <w:lang w:val="de-DE"/>
         </w:rPr>
         <w:t>r das Berichtsjahr 2025 bereits erledigt) + Teilnahme an der Vollversammlung</w:t>
       </w:r>
     </w:p>
     <w:p>
       <w:pPr>
-        <w:pStyle w:val="style179"/>
+        <w:pStyle w:val="Listenabsatz"/>
         <w:numPr>
           <w:ilvl w:val="0"/>
           <w:numId w:val="2"/>
         </w:numPr>
-        <w:rPr/>
-      </w:pPr>
-      <w:r>
-        <w:rPr>
-          <w:lang w:val="en-US"/>
+        <w:rPr>
+          <w:lang w:val="de-DE"/>
+        </w:rPr>
+      </w:pPr>
+      <w:r>
+        <w:rPr>
+          <w:lang w:val="de-DE"/>
         </w:rPr>
         <w:t>Termine der Kreisjugendfeuerwehr zum Jahresbeginn an Landrat direkt schicken (Achim.Broetel@neckar-odenwald-kreis.de)</w:t>
       </w:r>
     </w:p>
     <w:p>
       <w:pPr>
-        <w:pStyle w:val="style179"/>
+        <w:pStyle w:val="Listenabsatz"/>
         <w:numPr>
           <w:ilvl w:val="0"/>
           <w:numId w:val="2"/>
         </w:numPr>
-        <w:rPr/>
-      </w:pPr>
-      <w:r>
-        <w:rPr>
-          <w:lang w:val="en-US"/>
-        </w:rPr>
+      </w:pPr>
+      <w:r>
         <w:t>Teilnahme an Kreisjugendwartseminaren</w:t>
       </w:r>
     </w:p>
     <w:p>
       <w:pPr>
-        <w:pStyle w:val="style179"/>
+        <w:pStyle w:val="Listenabsatz"/>
         <w:numPr>
           <w:ilvl w:val="0"/>
           <w:numId w:val="2"/>
         </w:numPr>
-        <w:rPr/>
-      </w:pPr>
-      <w:r>
-        <w:rPr>
-          <w:lang w:val="en-US"/>
-        </w:rPr>
+      </w:pPr>
+      <w:r>
         <w:t>Teilnahme an Verbandsversammlung LFV</w:t>
       </w:r>
     </w:p>
     <w:p>
       <w:pPr>
-        <w:pStyle w:val="style179"/>
+        <w:pStyle w:val="Listenabsatz"/>
         <w:numPr>
           <w:ilvl w:val="0"/>
           <w:numId w:val="2"/>
         </w:numPr>
-        <w:rPr/>
-      </w:pPr>
-      <w:r>
-        <w:rPr>
-          <w:lang w:val="en-US"/>
+        <w:rPr>
+          <w:lang w:val="de-DE"/>
+        </w:rPr>
+      </w:pPr>
+      <w:r>
+        <w:rPr>
+          <w:lang w:val="de-DE"/>
         </w:rPr>
         <w:t>Genehmigungen der JULEICA-Antr</w:t>
       </w:r>
@@ -340,56 +325,50 @@
       </w:r>
       <w:r>
         <w:rPr>
-          <w:lang w:val="en-US"/>
+          <w:lang w:val="de-DE"/>
         </w:rPr>
         <w:t>ge (bekommt an ne Mail)</w:t>
       </w:r>
     </w:p>
     <w:p>
       <w:pPr>
-        <w:pStyle w:val="style179"/>
+        <w:pStyle w:val="Listenabsatz"/>
         <w:numPr>
           <w:ilvl w:val="0"/>
           <w:numId w:val="2"/>
         </w:numPr>
-        <w:rPr/>
-      </w:pPr>
-      <w:r>
-        <w:rPr>
-          <w:lang w:val="en-US"/>
+        <w:rPr>
+          <w:lang w:val="de-DE"/>
+        </w:rPr>
+      </w:pPr>
+      <w:r>
+        <w:rPr>
+          <w:lang w:val="de-DE"/>
         </w:rPr>
         <w:t>Alle 2 Jahre Statistik an Statitisches Landesamt (da kommt ein Schreiben)</w:t>
       </w:r>
     </w:p>
     <w:p>
       <w:pPr>
-        <w:pStyle w:val="style179"/>
+        <w:pStyle w:val="Listenabsatz"/>
         <w:numPr>
           <w:ilvl w:val="0"/>
           <w:numId w:val="2"/>
         </w:numPr>
-        <w:rPr/>
-      </w:pPr>
-      <w:r>
-        <w:rPr>
-          <w:lang w:val="en-US"/>
-        </w:rPr>
+      </w:pPr>
+      <w:r>
         <w:t>Teilnahme an Sitzungen der Region</w:t>
       </w:r>
     </w:p>
     <w:p>
       <w:pPr>
-        <w:pStyle w:val="style179"/>
+        <w:pStyle w:val="Listenabsatz"/>
         <w:numPr>
           <w:ilvl w:val="0"/>
           <w:numId w:val="2"/>
         </w:numPr>
-        <w:rPr/>
-      </w:pPr>
-      <w:r>
-        <w:rPr>
-          <w:lang w:val="en-US"/>
-        </w:rPr>
+      </w:pPr>
+      <w:r>
         <w:t>Jahresberichte (mit Rainer kl</w:t>
       </w:r>
       <w:r>
@@ -399,24 +378,23 @@
         <w:t>ä</w:t>
       </w:r>
       <w:r>
-        <w:rPr>
-          <w:lang w:val="en-US"/>
-        </w:rPr>
         <w:t>ren)</w:t>
       </w:r>
     </w:p>
     <w:p>
       <w:pPr>
-        <w:pStyle w:val="style179"/>
+        <w:pStyle w:val="Listenabsatz"/>
         <w:numPr>
           <w:ilvl w:val="0"/>
           <w:numId w:val="2"/>
         </w:numPr>
-        <w:rPr/>
-      </w:pPr>
-      <w:r>
-        <w:rPr>
-          <w:lang w:val="en-US"/>
+        <w:rPr>
+          <w:lang w:val="de-DE"/>
+        </w:rPr>
+      </w:pPr>
+      <w:r>
+        <w:rPr>
+          <w:lang w:val="de-DE"/>
         </w:rPr>
         <w:t>Weiterleitung der Mails vom Jugendb</w:t>
       </w:r>
@@ -428,7 +406,7 @@
       </w:r>
       <w:r>
         <w:rPr>
-          <w:lang w:val="en-US"/>
+          <w:lang w:val="de-DE"/>
         </w:rPr>
         <w:t>ro (</w:t>
       </w:r>
@@ -440,23 +418,25 @@
       </w:r>
       <w:r>
         <w:rPr>
-          <w:lang w:val="en-US"/>
+          <w:lang w:val="de-DE"/>
         </w:rPr>
         <w:t>ber Newsletter eigene Sachen wegen Schwierigkeiten in der Zustellung)</w:t>
       </w:r>
     </w:p>
     <w:p>
       <w:pPr>
-        <w:pStyle w:val="style179"/>
+        <w:pStyle w:val="Listenabsatz"/>
         <w:numPr>
           <w:ilvl w:val="0"/>
           <w:numId w:val="2"/>
         </w:numPr>
-        <w:rPr/>
-      </w:pPr>
-      <w:r>
-        <w:rPr>
-          <w:lang w:val="en-US"/>
+        <w:rPr>
+          <w:lang w:val="de-DE"/>
+        </w:rPr>
+      </w:pPr>
+      <w:r>
+        <w:rPr>
+          <w:lang w:val="de-DE"/>
         </w:rPr>
         <w:t>Termine kl</w:t>
       </w:r>
@@ -468,23 +448,25 @@
       </w:r>
       <w:r>
         <w:rPr>
-          <w:lang w:val="en-US"/>
+          <w:lang w:val="de-DE"/>
         </w:rPr>
         <w:t>ren, mit Ausrichter koordinieren, Verpflegungen (zb bei Jahreshauptversammlung) besprechen</w:t>
       </w:r>
     </w:p>
     <w:p>
       <w:pPr>
-        <w:pStyle w:val="style179"/>
+        <w:pStyle w:val="Listenabsatz"/>
         <w:numPr>
           <w:ilvl w:val="0"/>
           <w:numId w:val="2"/>
         </w:numPr>
-        <w:rPr/>
-      </w:pPr>
-      <w:r>
-        <w:rPr>
-          <w:lang w:val="en-US"/>
+        <w:rPr>
+          <w:lang w:val="de-DE"/>
+        </w:rPr>
+      </w:pPr>
+      <w:r>
+        <w:rPr>
+          <w:lang w:val="de-DE"/>
         </w:rPr>
         <w:t>Zeltlagerausrichter suchen, Pl</w:t>
       </w:r>
@@ -496,7 +478,7 @@
       </w:r>
       <w:r>
         <w:rPr>
-          <w:lang w:val="en-US"/>
+          <w:lang w:val="de-DE"/>
         </w:rPr>
         <w:t>tze anschauen (Rainer, Joshi und J</w:t>
       </w:r>
@@ -508,7 +490,7 @@
       </w:r>
       <w:r>
         <w:rPr>
-          <w:lang w:val="en-US"/>
+          <w:lang w:val="de-DE"/>
         </w:rPr>
         <w:t>rgen mit ins Boot holen), M</w:t>
       </w:r>
@@ -520,23 +502,25 @@
       </w:r>
       <w:r>
         <w:rPr>
-          <w:lang w:val="en-US"/>
+          <w:lang w:val="de-DE"/>
         </w:rPr>
         <w:t>glichkeiten checken, Checkliste mitnehmen und/oder vorab schicken, immer wieder abgleichen</w:t>
       </w:r>
     </w:p>
     <w:p>
       <w:pPr>
-        <w:pStyle w:val="style179"/>
+        <w:pStyle w:val="Listenabsatz"/>
         <w:numPr>
           <w:ilvl w:val="0"/>
           <w:numId w:val="2"/>
         </w:numPr>
-        <w:rPr/>
-      </w:pPr>
-      <w:r>
-        <w:rPr>
-          <w:lang w:val="en-US"/>
+        <w:rPr>
+          <w:lang w:val="de-DE"/>
+        </w:rPr>
+      </w:pPr>
+      <w:r>
+        <w:rPr>
+          <w:lang w:val="de-DE"/>
         </w:rPr>
         <w:t>Fürs nächste Jahr: T-Shirts f</w:t>
       </w:r>
@@ -548,7 +532,7 @@
       </w:r>
       <w:r>
         <w:rPr>
-          <w:lang w:val="en-US"/>
+          <w:lang w:val="de-DE"/>
         </w:rPr>
         <w:t>r das K</w:t>
       </w:r>
@@ -560,23 +544,25 @@
       </w:r>
       <w:r>
         <w:rPr>
-          <w:lang w:val="en-US"/>
+          <w:lang w:val="de-DE"/>
         </w:rPr>
         <w:t>chenteam</w:t>
       </w:r>
     </w:p>
     <w:p>
       <w:pPr>
-        <w:pStyle w:val="style179"/>
+        <w:pStyle w:val="Listenabsatz"/>
         <w:numPr>
           <w:ilvl w:val="0"/>
           <w:numId w:val="2"/>
         </w:numPr>
-        <w:rPr/>
-      </w:pPr>
-      <w:r>
-        <w:rPr>
-          <w:lang w:val="en-US"/>
+        <w:rPr>
+          <w:lang w:val="de-DE"/>
+        </w:rPr>
+      </w:pPr>
+      <w:r>
+        <w:rPr>
+          <w:lang w:val="de-DE"/>
         </w:rPr>
         <w:t>Ehrungen rechtzeitig beantragen, musikalische Umrahmung/Pfarrer (Lukas??), Pr</w:t>
       </w:r>
@@ -588,23 +574,25 @@
       </w:r>
       <w:r>
         <w:rPr>
-          <w:lang w:val="en-US"/>
+          <w:lang w:val="de-DE"/>
         </w:rPr>
         <w:t>sente organisieren</w:t>
       </w:r>
     </w:p>
     <w:p>
       <w:pPr>
-        <w:pStyle w:val="style179"/>
+        <w:pStyle w:val="Listenabsatz"/>
         <w:numPr>
           <w:ilvl w:val="0"/>
           <w:numId w:val="2"/>
         </w:numPr>
-        <w:rPr/>
-      </w:pPr>
-      <w:r>
-        <w:rPr>
-          <w:lang w:val="en-US"/>
+        <w:rPr>
+          <w:lang w:val="de-DE"/>
+        </w:rPr>
+      </w:pPr>
+      <w:r>
+        <w:rPr>
+          <w:lang w:val="de-DE"/>
         </w:rPr>
         <w:t>Preis f</w:t>
       </w:r>
@@ -616,23 +604,25 @@
       </w:r>
       <w:r>
         <w:rPr>
-          <w:lang w:val="en-US"/>
+          <w:lang w:val="de-DE"/>
         </w:rPr>
         <w:t>rs Zeltlager neu kalkulieren (mit Holger bzw. Ausschuss besprechen)</w:t>
       </w:r>
     </w:p>
     <w:p>
       <w:pPr>
-        <w:pStyle w:val="style179"/>
+        <w:pStyle w:val="Listenabsatz"/>
         <w:numPr>
           <w:ilvl w:val="0"/>
           <w:numId w:val="2"/>
         </w:numPr>
-        <w:rPr/>
-      </w:pPr>
-      <w:r>
-        <w:rPr>
-          <w:lang w:val="en-US"/>
+        <w:rPr>
+          <w:lang w:val="de-DE"/>
+        </w:rPr>
+      </w:pPr>
+      <w:r>
+        <w:rPr>
+          <w:lang w:val="de-DE"/>
         </w:rPr>
         <w:t>Ausschreibungen der Veranstaltungen rechtzeitig, Ehreng</w:t>
       </w:r>
@@ -644,39 +634,44 @@
       </w:r>
       <w:r>
         <w:rPr>
-          <w:lang w:val="en-US"/>
+          <w:lang w:val="de-DE"/>
         </w:rPr>
         <w:t>ste werden separat eingeladen</w:t>
       </w:r>
     </w:p>
     <w:p>
       <w:pPr>
-        <w:pStyle w:val="style179"/>
+        <w:pStyle w:val="Listenabsatz"/>
         <w:numPr>
           <w:ilvl w:val="0"/>
           <w:numId w:val="2"/>
         </w:numPr>
-        <w:rPr/>
-      </w:pPr>
-      <w:r>
-        <w:rPr>
-          <w:lang w:val="en-US"/>
-        </w:rPr>
+        <w:rPr>
+          <w:lang w:val="de-DE"/>
+        </w:rPr>
+      </w:pPr>
+      <w:r>
+        <w:rPr>
+          <w:lang w:val="de-DE"/>
+        </w:rPr>
+        <w:lastRenderedPageBreak/>
         <w:t>Bei Delegiertenversammlung die Einladung von 4 Wochen vorher beachten</w:t>
       </w:r>
     </w:p>
     <w:p>
       <w:pPr>
-        <w:pStyle w:val="style179"/>
+        <w:pStyle w:val="Listenabsatz"/>
         <w:numPr>
           <w:ilvl w:val="0"/>
           <w:numId w:val="2"/>
         </w:numPr>
-        <w:rPr/>
-      </w:pPr>
-      <w:r>
-        <w:rPr>
-          <w:lang w:val="en-US"/>
+        <w:rPr>
+          <w:lang w:val="de-DE"/>
+        </w:rPr>
+      </w:pPr>
+      <w:r>
+        <w:rPr>
+          <w:lang w:val="de-DE"/>
         </w:rPr>
         <w:t>Dreil</w:t>
       </w:r>
@@ -688,7 +683,7 @@
       </w:r>
       <w:r>
         <w:rPr>
-          <w:lang w:val="en-US"/>
+          <w:lang w:val="de-DE"/>
         </w:rPr>
         <w:t>ndertreffen bei Ausrichtung im NOK mit Ausrichter abstimmen, es gibt immer 3 Spiele pro Landkreis f</w:t>
       </w:r>
@@ -700,7 +695,7 @@
       </w:r>
       <w:r>
         <w:rPr>
-          <w:lang w:val="en-US"/>
+          <w:lang w:val="de-DE"/>
         </w:rPr>
         <w:t>r die Jugendfeuerwehr und 2 Spiele pro Landkreis f</w:t>
       </w:r>
@@ -712,24 +707,20 @@
       </w:r>
       <w:r>
         <w:rPr>
-          <w:lang w:val="en-US"/>
+          <w:lang w:val="de-DE"/>
         </w:rPr>
         <w:t xml:space="preserve">r die Kindergruppen (also insgesamt 9 und 6 Spiele), dabei bringt jeder immer die entsprechenden Schiedsrichter selbst mit. Im Vorfeld wird am Ort der Veranstaltung eine Vorbesprechung gemacht mit KJF und aktivem Verband (auch KBM), da gibt's auch immer ein Essen. </w:t>
       </w:r>
     </w:p>
     <w:p>
       <w:pPr>
-        <w:pStyle w:val="style179"/>
+        <w:pStyle w:val="Listenabsatz"/>
         <w:numPr>
           <w:ilvl w:val="0"/>
           <w:numId w:val="2"/>
         </w:numPr>
-        <w:rPr/>
-      </w:pPr>
-      <w:r>
-        <w:rPr>
-          <w:lang w:val="en-US"/>
-        </w:rPr>
+      </w:pPr>
+      <w:r>
         <w:t>H</w:t>
       </w:r>
       <w:r>
@@ -739,24 +730,23 @@
         <w:t>ü</w:t>
       </w:r>
       <w:r>
-        <w:rPr>
-          <w:lang w:val="en-US"/>
-        </w:rPr>
         <w:t>ttenwochenende plant das Jugendforum</w:t>
       </w:r>
     </w:p>
     <w:p>
       <w:pPr>
-        <w:pStyle w:val="style179"/>
+        <w:pStyle w:val="Listenabsatz"/>
         <w:numPr>
           <w:ilvl w:val="0"/>
           <w:numId w:val="2"/>
         </w:numPr>
-        <w:rPr/>
-      </w:pPr>
-      <w:r>
-        <w:rPr>
-          <w:lang w:val="en-US"/>
+        <w:rPr>
+          <w:lang w:val="de-DE"/>
+        </w:rPr>
+      </w:pPr>
+      <w:r>
+        <w:rPr>
+          <w:lang w:val="de-DE"/>
         </w:rPr>
         <w:t>Kindergruppentag w</w:t>
       </w:r>
@@ -768,23 +758,22 @@
       </w:r>
       <w:r>
         <w:rPr>
-          <w:lang w:val="en-US"/>
+          <w:lang w:val="de-DE"/>
         </w:rPr>
         <w:t>re Part des Fachgebietes, welches noch zu besetzen ist (Lilly Haag mal fragen?)</w:t>
       </w:r>
     </w:p>
     <w:p>
       <w:pPr>
-        <w:pStyle w:val="style179"/>
+        <w:pStyle w:val="Listenabsatz"/>
         <w:numPr>
           <w:ilvl w:val="0"/>
           <w:numId w:val="2"/>
         </w:numPr>
-        <w:rPr/>
-      </w:pPr>
-      <w:r>
-        <w:rPr>
-          <w:lang w:val="en-US"/>
+      </w:pPr>
+      <w:r>
+        <w:rPr>
+          <w:lang w:val="de-DE"/>
         </w:rPr>
         <w:t>Bei Ehrungen, die die JF bei sich selbst durchf</w:t>
       </w:r>
@@ -796,7 +785,7 @@
       </w:r>
       <w:r>
         <w:rPr>
-          <w:lang w:val="en-US"/>
+          <w:lang w:val="de-DE"/>
         </w:rPr>
         <w:t>hrt (beispielsweise anl</w:t>
       </w:r>
@@ -808,7 +797,7 @@
       </w:r>
       <w:r>
         <w:rPr>
-          <w:lang w:val="en-US"/>
+          <w:lang w:val="de-DE"/>
         </w:rPr>
         <w:t>sslich Jubil</w:t>
       </w:r>
@@ -820,7 +809,7 @@
       </w:r>
       <w:r>
         <w:rPr>
-          <w:lang w:val="en-US"/>
+          <w:lang w:val="de-DE"/>
         </w:rPr>
         <w:t>ums-Festakt, Ehrungsabenden,JHV o.</w:t>
       </w:r>
@@ -832,7 +821,7 @@
       </w:r>
       <w:r>
         <w:rPr>
-          <w:lang w:val="en-US"/>
+          <w:lang w:val="de-DE"/>
         </w:rPr>
         <w:t xml:space="preserve">.) entweder selbst, Stellvertrter, Kreisehrungen können auch von Mitgliedern des Ausschusses </w:t>
       </w:r>
@@ -844,23 +833,25 @@
       </w:r>
       <w:r>
         <w:rPr>
-          <w:lang w:val="en-US"/>
-        </w:rPr>
-        <w:t>bernommen werden. KFV der KBM geht auch (hier halt absprechen)</w:t>
-      </w:r>
-    </w:p>
-    <w:p>
-      <w:pPr>
-        <w:pStyle w:val="style179"/>
+          <w:lang w:val="de-DE"/>
+        </w:rPr>
+        <w:t xml:space="preserve">bernommen werden. </w:t>
+      </w:r>
+      <w:r>
+        <w:t>KFV der KBM geht auch (hier halt absprechen)</w:t>
+      </w:r>
+    </w:p>
+    <w:p>
+      <w:pPr>
+        <w:pStyle w:val="Listenabsatz"/>
         <w:numPr>
           <w:ilvl w:val="0"/>
           <w:numId w:val="2"/>
         </w:numPr>
-        <w:rPr/>
-      </w:pPr>
-      <w:r>
-        <w:rPr>
-          <w:lang w:val="en-US"/>
+      </w:pPr>
+      <w:r>
+        <w:rPr>
+          <w:lang w:val="de-DE"/>
         </w:rPr>
         <w:t>Ehrungen (au</w:t>
       </w:r>
@@ -872,7 +863,7 @@
       </w:r>
       <w:r>
         <w:rPr>
-          <w:lang w:val="en-US"/>
+          <w:lang w:val="de-DE"/>
         </w:rPr>
         <w:t>er Kreisehrungen) sind im Jugendb</w:t>
       </w:r>
@@ -884,9 +875,12 @@
       </w:r>
       <w:r>
         <w:rPr>
-          <w:lang w:val="en-US"/>
-        </w:rPr>
-        <w:t xml:space="preserve">ro zu beantragen, Forumular kann auf der HP heruntergeladenwerden. Auch Ehrungen der DJF werden </w:t>
+          <w:lang w:val="de-DE"/>
+        </w:rPr>
+        <w:t xml:space="preserve">ro zu beantragen, Forumular kann auf der HP heruntergeladenwerden. </w:t>
+      </w:r>
+      <w:r>
+        <w:t xml:space="preserve">Auch Ehrungen der DJF werden </w:t>
       </w:r>
       <w:r>
         <w:rPr>
@@ -895,47 +889,13 @@
         <w:t>ü</w:t>
       </w:r>
       <w:r>
-        <w:rPr>
-          <w:lang w:val="en-US"/>
-        </w:rPr>
         <w:t xml:space="preserve">bers Land beantragt. </w:t>
       </w:r>
     </w:p>
-    <w:p>
-      <w:pPr>
-        <w:pStyle w:val="style0"/>
-        <w:numPr>
-          <w:ilvl w:val="0"/>
-          <w:numId w:val="0"/>
-        </w:numPr>
-        <w:rPr/>
-      </w:pPr>
-    </w:p>
-    <w:p>
-      <w:pPr>
-        <w:pStyle w:val="style0"/>
-        <w:numPr>
-          <w:ilvl w:val="0"/>
-          <w:numId w:val="0"/>
-        </w:numPr>
-        <w:rPr/>
-      </w:pPr>
-    </w:p>
-    <w:p>
-      <w:pPr>
-        <w:pStyle w:val="style0"/>
-        <w:numPr>
-          <w:ilvl w:val="0"/>
-          <w:numId w:val="0"/>
-        </w:numPr>
-        <w:rPr>
-          <w:lang w:val="en-US"/>
-        </w:rPr>
-      </w:pPr>
-      <w:r>
-        <w:rPr>
-          <w:lang w:val="en-US"/>
-        </w:rPr>
+    <w:p/>
+    <w:p/>
+    <w:p>
+      <w:r>
         <w:t>Bereits bestehende</w:t>
       </w:r>
       <w:r>
@@ -945,77 +905,57 @@
         <w:t xml:space="preserve"> </w:t>
       </w:r>
       <w:r>
-        <w:rPr>
-          <w:lang w:val="en-US"/>
-        </w:rPr>
         <w:t>Termine:</w:t>
       </w:r>
     </w:p>
-    <w:p>
-      <w:pPr>
-        <w:pStyle w:val="style0"/>
-        <w:numPr>
-          <w:ilvl w:val="0"/>
-          <w:numId w:val="0"/>
-        </w:numPr>
-        <w:rPr>
-          <w:lang w:val="en-US"/>
-        </w:rPr>
-      </w:pPr>
-    </w:p>
-    <w:p>
-      <w:pPr>
-        <w:pStyle w:val="style179"/>
+    <w:p/>
+    <w:p>
+      <w:pPr>
+        <w:pStyle w:val="Listenabsatz"/>
         <w:numPr>
           <w:ilvl w:val="0"/>
           <w:numId w:val="3"/>
         </w:numPr>
-        <w:rPr/>
-      </w:pPr>
-      <w:r>
-        <w:rPr>
-          <w:lang w:val="en-US"/>
+        <w:rPr>
+          <w:lang w:val="de-DE"/>
+        </w:rPr>
+      </w:pPr>
+      <w:r>
+        <w:rPr>
+          <w:lang w:val="de-DE"/>
         </w:rPr>
         <w:t xml:space="preserve">19.11.2026 </w:t>
       </w:r>
       <w:r>
         <w:rPr>
-          <w:lang w:val="en-US"/>
+          <w:lang w:val="de-DE"/>
         </w:rPr>
         <w:tab/>
-      </w:r>
-      <w:r>
-        <w:rPr>
-          <w:lang w:val="en-US"/>
-        </w:rPr>
         <w:t>Vollversammlung KJR (Einladung wurde noch nicht verschickt)</w:t>
       </w:r>
     </w:p>
     <w:p>
       <w:pPr>
-        <w:pStyle w:val="style179"/>
+        <w:pStyle w:val="Listenabsatz"/>
         <w:numPr>
           <w:ilvl w:val="0"/>
           <w:numId w:val="3"/>
         </w:numPr>
-        <w:rPr/>
-      </w:pPr>
-      <w:r>
-        <w:rPr>
-          <w:lang w:val="en-US"/>
+        <w:rPr>
+          <w:lang w:val="de-DE"/>
+        </w:rPr>
+      </w:pPr>
+      <w:r>
+        <w:rPr>
+          <w:lang w:val="de-DE"/>
         </w:rPr>
         <w:t>08.12.2026</w:t>
       </w:r>
       <w:r>
         <w:rPr>
-          <w:lang w:val="en-US"/>
+          <w:lang w:val="de-DE"/>
         </w:rPr>
         <w:tab/>
-      </w:r>
-      <w:r>
-        <w:rPr>
-          <w:lang w:val="en-US"/>
-        </w:rPr>
         <w:t>Jahresabschluss, Feuerwehrger</w:t>
       </w:r>
       <w:r>
@@ -1026,88 +966,81 @@
       </w:r>
       <w:r>
         <w:rPr>
-          <w:lang w:val="en-US"/>
+          <w:lang w:val="de-DE"/>
         </w:rPr>
         <w:t xml:space="preserve">tehaus Limbach mit Neuwahl </w:t>
       </w:r>
       <w:r>
         <w:rPr>
-          <w:lang w:val="en-US"/>
+          <w:lang w:val="de-DE"/>
         </w:rPr>
         <w:tab/>
       </w:r>
       <w:r>
         <w:rPr>
-          <w:lang w:val="en-US"/>
+          <w:lang w:val="de-DE"/>
         </w:rPr>
         <w:tab/>
       </w:r>
       <w:r>
         <w:rPr>
-          <w:lang w:val="en-US"/>
+          <w:lang w:val="de-DE"/>
         </w:rPr>
         <w:tab/>
-      </w:r>
-      <w:r>
-        <w:rPr>
-          <w:lang w:val="en-US"/>
-        </w:rPr>
         <w:t>Kreisjugendsprecher</w:t>
       </w:r>
     </w:p>
     <w:p>
       <w:pPr>
-        <w:pStyle w:val="style179"/>
+        <w:pStyle w:val="Listenabsatz"/>
         <w:numPr>
           <w:ilvl w:val="0"/>
           <w:numId w:val="3"/>
         </w:numPr>
-        <w:rPr/>
-      </w:pPr>
-      <w:r>
-        <w:rPr>
-          <w:lang w:val="en-US"/>
+        <w:rPr>
+          <w:lang w:val="de-DE"/>
+        </w:rPr>
+      </w:pPr>
+      <w:r>
+        <w:rPr>
+          <w:lang w:val="de-DE"/>
         </w:rPr>
         <w:t>23.04.2027</w:t>
       </w:r>
       <w:r>
         <w:rPr>
-          <w:lang w:val="en-US"/>
+          <w:lang w:val="de-DE"/>
         </w:rPr>
         <w:tab/>
-      </w:r>
-      <w:r>
-        <w:rPr>
-          <w:lang w:val="en-US"/>
-        </w:rPr>
         <w:t>Verbandsversammlung KFV in Schwarzach</w:t>
       </w:r>
-    </w:p>
-    <w:p>
-      <w:pPr>
-        <w:pStyle w:val="style179"/>
+      <w:r>
+        <w:rPr>
+          <w:lang w:val="de-DE"/>
+        </w:rPr>
+        <w:t xml:space="preserve"> -&gt; </w:t>
+      </w:r>
+      <w:r>
+        <w:rPr>
+          <w:highlight w:val="yellow"/>
+          <w:lang w:val="de-DE"/>
+        </w:rPr>
+        <w:t>Jahresbericht</w:t>
+      </w:r>
+    </w:p>
+    <w:p>
+      <w:pPr>
+        <w:pStyle w:val="Listenabsatz"/>
         <w:numPr>
           <w:ilvl w:val="0"/>
           <w:numId w:val="3"/>
         </w:numPr>
-        <w:rPr/>
-      </w:pPr>
-      <w:r>
-        <w:rPr>
-          <w:lang w:val="en-US"/>
-        </w:rPr>
+      </w:pPr>
+      <w:r>
         <w:t>5./6.5.2027</w:t>
       </w:r>
       <w:r>
-        <w:rPr>
-          <w:lang w:val="en-US"/>
-        </w:rPr>
         <w:tab/>
-      </w:r>
-      <w:r>
-        <w:rPr>
-          <w:lang w:val="en-US"/>
-        </w:rPr>
         <w:t>H</w:t>
       </w:r>
       <w:r>
@@ -1117,43 +1050,37 @@
         <w:t>ü</w:t>
       </w:r>
       <w:r>
-        <w:rPr>
-          <w:lang w:val="en-US"/>
-        </w:rPr>
         <w:t>ttenwochenende</w:t>
       </w:r>
     </w:p>
     <w:p>
       <w:pPr>
-        <w:pStyle w:val="style179"/>
+        <w:pStyle w:val="Listenabsatz"/>
         <w:numPr>
           <w:ilvl w:val="0"/>
           <w:numId w:val="3"/>
         </w:numPr>
-        <w:rPr/>
-      </w:pPr>
-      <w:r>
-        <w:rPr>
-          <w:lang w:val="en-US"/>
+        <w:rPr>
+          <w:lang w:val="de-DE"/>
+        </w:rPr>
+      </w:pPr>
+      <w:r>
+        <w:rPr>
+          <w:lang w:val="de-DE"/>
         </w:rPr>
         <w:t>9.-11.7.</w:t>
       </w:r>
       <w:r>
         <w:rPr>
-          <w:lang w:val="en-US"/>
+          <w:lang w:val="de-DE"/>
         </w:rPr>
         <w:tab/>
       </w:r>
       <w:r>
         <w:rPr>
-          <w:lang w:val="en-US"/>
+          <w:lang w:val="de-DE"/>
         </w:rPr>
         <w:tab/>
-      </w:r>
-      <w:r>
-        <w:rPr>
-          <w:lang w:val="en-US"/>
-        </w:rPr>
         <w:t>Zeltlager (noch final zu kl</w:t>
       </w:r>
       <w:r>
@@ -1164,36 +1091,33 @@
       </w:r>
       <w:r>
         <w:rPr>
-          <w:lang w:val="en-US"/>
+          <w:lang w:val="de-DE"/>
         </w:rPr>
         <w:t xml:space="preserve">ren), Limbach-Krumbach </w:t>
       </w:r>
     </w:p>
     <w:p>
       <w:pPr>
-        <w:pStyle w:val="style179"/>
+        <w:pStyle w:val="Listenabsatz"/>
         <w:numPr>
           <w:ilvl w:val="0"/>
           <w:numId w:val="3"/>
         </w:numPr>
-        <w:rPr/>
-      </w:pPr>
-      <w:r>
-        <w:rPr>
-          <w:lang w:val="en-US"/>
+        <w:rPr>
+          <w:lang w:val="de-DE"/>
+        </w:rPr>
+      </w:pPr>
+      <w:r>
+        <w:rPr>
+          <w:lang w:val="de-DE"/>
         </w:rPr>
         <w:t>11.09.2027</w:t>
       </w:r>
       <w:r>
         <w:rPr>
-          <w:lang w:val="en-US"/>
+          <w:lang w:val="de-DE"/>
         </w:rPr>
         <w:tab/>
-      </w:r>
-      <w:r>
-        <w:rPr>
-          <w:lang w:val="en-US"/>
-        </w:rPr>
         <w:t xml:space="preserve">"Spiel ohne Grenzen </w:t>
       </w:r>
       <w:r>
@@ -1204,7 +1128,7 @@
       </w:r>
       <w:r>
         <w:rPr>
-          <w:lang w:val="en-US"/>
+          <w:lang w:val="de-DE"/>
         </w:rPr>
         <w:t>ber Grenzen" DLT in Walld</w:t>
       </w:r>
@@ -1216,151 +1140,130 @@
       </w:r>
       <w:r>
         <w:rPr>
-          <w:lang w:val="en-US"/>
+          <w:lang w:val="de-DE"/>
         </w:rPr>
         <w:t>rn</w:t>
       </w:r>
     </w:p>
     <w:p>
       <w:pPr>
-        <w:pStyle w:val="style179"/>
+        <w:pStyle w:val="Listenabsatz"/>
         <w:numPr>
           <w:ilvl w:val="0"/>
           <w:numId w:val="3"/>
         </w:numPr>
-        <w:rPr/>
-      </w:pPr>
-      <w:r>
-        <w:rPr>
-          <w:lang w:val="en-US"/>
-        </w:rPr>
+      </w:pPr>
+      <w:r>
         <w:t>18.9.2027</w:t>
       </w:r>
       <w:r>
-        <w:rPr>
-          <w:lang w:val="en-US"/>
-        </w:rPr>
         <w:tab/>
-      </w:r>
-      <w:r>
-        <w:rPr>
-          <w:lang w:val="en-US"/>
-        </w:rPr>
         <w:t>Delegiertenversammlung JF BW im Bodenseekreis</w:t>
       </w:r>
     </w:p>
     <w:p>
       <w:pPr>
-        <w:pStyle w:val="style179"/>
+        <w:pStyle w:val="Listenabsatz"/>
         <w:numPr>
           <w:ilvl w:val="0"/>
           <w:numId w:val="3"/>
         </w:numPr>
-        <w:rPr/>
-      </w:pPr>
-      <w:r>
-        <w:rPr>
-          <w:lang w:val="en-US"/>
-        </w:rPr>
+      </w:pPr>
+      <w:r>
         <w:t>21.-23.10.</w:t>
       </w:r>
       <w:r>
-        <w:rPr>
-          <w:lang w:val="en-US"/>
-        </w:rPr>
         <w:tab/>
-      </w:r>
-      <w:r>
-        <w:rPr>
-          <w:lang w:val="en-US"/>
-        </w:rPr>
         <w:t>Verbandsversammlung LFV in Ludwigsburg</w:t>
       </w:r>
     </w:p>
     <w:p>
       <w:pPr>
-        <w:pStyle w:val="style179"/>
+        <w:pStyle w:val="Listenabsatz"/>
         <w:numPr>
           <w:ilvl w:val="0"/>
           <w:numId w:val="3"/>
         </w:numPr>
-        <w:rPr/>
-      </w:pPr>
-      <w:r>
-        <w:rPr>
-          <w:lang w:val="en-US"/>
-        </w:rPr>
+      </w:pPr>
+      <w:r>
         <w:t>07.12.2027</w:t>
       </w:r>
       <w:r>
-        <w:rPr>
-          <w:lang w:val="en-US"/>
-        </w:rPr>
         <w:tab/>
-      </w:r>
-      <w:r>
-        <w:rPr>
-          <w:lang w:val="en-US"/>
-        </w:rPr>
         <w:t>Jahresabschluss</w:t>
       </w:r>
     </w:p>
     <w:p>
       <w:pPr>
-        <w:pStyle w:val="style179"/>
+        <w:pStyle w:val="Listenabsatz"/>
         <w:numPr>
           <w:ilvl w:val="0"/>
           <w:numId w:val="3"/>
         </w:numPr>
-        <w:rPr/>
-      </w:pPr>
-      <w:r>
-        <w:rPr>
-          <w:lang w:val="en-US"/>
+        <w:rPr>
+          <w:lang w:val="de-DE"/>
+        </w:rPr>
+      </w:pPr>
+      <w:r>
+        <w:rPr>
+          <w:lang w:val="de-DE"/>
         </w:rPr>
         <w:t>??</w:t>
       </w:r>
       <w:r>
         <w:rPr>
-          <w:lang w:val="en-US"/>
+          <w:lang w:val="de-DE"/>
         </w:rPr>
         <w:tab/>
       </w:r>
       <w:r>
         <w:rPr>
-          <w:lang w:val="en-US"/>
+          <w:lang w:val="de-DE"/>
         </w:rPr>
         <w:tab/>
-      </w:r>
-      <w:r>
-        <w:rPr>
-          <w:lang w:val="en-US"/>
-        </w:rPr>
         <w:t xml:space="preserve">Kindergruppenspielenachmittag wieder auf der Alla-Hopp in </w:t>
       </w:r>
       <w:r>
         <w:rPr>
-          <w:lang w:val="en-US"/>
+          <w:lang w:val="de-DE"/>
         </w:rPr>
         <w:tab/>
       </w:r>
       <w:r>
         <w:rPr>
-          <w:lang w:val="en-US"/>
+          <w:lang w:val="de-DE"/>
         </w:rPr>
         <w:tab/>
       </w:r>
       <w:r>
         <w:rPr>
-          <w:lang w:val="en-US"/>
+          <w:lang w:val="de-DE"/>
         </w:rPr>
         <w:tab/>
       </w:r>
       <w:r>
         <w:rPr>
-          <w:lang w:val="en-US"/>
-        </w:rPr>
-        <w:t>Merchingen? Kontakt zur Ortsvorsteherin, die die H</w:t>
+          <w:lang w:val="de-DE"/>
+        </w:rPr>
+        <w:tab/>
+      </w:r>
+      <w:r>
+        <w:rPr>
+          <w:lang w:val="de-DE"/>
+        </w:rPr>
+        <w:tab/>
+      </w:r>
+      <w:r>
+        <w:rPr>
+          <w:lang w:val="de-DE"/>
+        </w:rPr>
+        <w:t xml:space="preserve">Merchingen? </w:t>
+      </w:r>
+      <w:r>
+        <w:rPr>
+          <w:lang w:val="de-DE"/>
+        </w:rPr>
+        <w:t>Kontakt zur Ortsvorsteherin, die die H</w:t>
       </w:r>
       <w:r>
         <w:rPr>
@@ -1370,107 +1273,108 @@
       </w:r>
       <w:r>
         <w:rPr>
-          <w:lang w:val="en-US"/>
-        </w:rPr>
-        <w:t xml:space="preserve">tte vermietet, </w:t>
-      </w:r>
-      <w:r>
-        <w:rPr>
-          <w:lang w:val="en-US"/>
+          <w:lang w:val="de-DE"/>
+        </w:rPr>
+        <w:t>tte vermietet,</w:t>
+      </w:r>
+      <w:r>
+        <w:rPr>
+          <w:lang w:val="de-DE"/>
+        </w:rPr>
+        <w:t xml:space="preserve"> </w:t>
+      </w:r>
+      <w:r>
+        <w:rPr>
+          <w:lang w:val="de-DE"/>
+        </w:rPr>
+        <w:t>h</w:t>
+      </w:r>
+      <w:r>
+        <w:rPr>
+          <w:lang w:val="de-DE"/>
+        </w:rPr>
+        <w:t>ä</w:t>
+      </w:r>
+      <w:r>
+        <w:rPr>
+          <w:lang w:val="de-DE"/>
+        </w:rPr>
+        <w:t>tte ic</w:t>
+      </w:r>
+      <w:r>
+        <w:rPr>
+          <w:lang w:val="de-DE"/>
+        </w:rPr>
+        <w:t>h n</w:t>
+      </w:r>
+      <w:r>
+        <w:rPr>
+          <w:lang w:val="de-DE"/>
+        </w:rPr>
+        <w:t>och</w:t>
+      </w:r>
+    </w:p>
+    <w:p>
+      <w:pPr>
+        <w:pStyle w:val="Listenabsatz"/>
+        <w:numPr>
+          <w:ilvl w:val="0"/>
+          <w:numId w:val="3"/>
+        </w:numPr>
+        <w:rPr>
+          <w:lang w:val="de-DE"/>
+        </w:rPr>
+      </w:pPr>
+      <w:r>
+        <w:rPr>
+          <w:lang w:val="de-DE"/>
+        </w:rPr>
+        <w:t>??</w:t>
+      </w:r>
+      <w:r>
+        <w:rPr>
+          <w:lang w:val="de-DE"/>
         </w:rPr>
         <w:tab/>
       </w:r>
       <w:r>
         <w:rPr>
-          <w:lang w:val="en-US"/>
+          <w:lang w:val="de-DE"/>
         </w:rPr>
         <w:tab/>
-      </w:r>
-      <w:r>
-        <w:rPr>
-          <w:lang w:val="en-US"/>
-        </w:rPr>
-        <w:t>h</w:t>
-      </w:r>
-      <w:r>
-        <w:rPr>
-          <w:lang w:val="de-DE"/>
-        </w:rPr>
-        <w:t>ä</w:t>
-      </w:r>
-      <w:r>
-        <w:rPr>
-          <w:lang w:val="en-US"/>
-        </w:rPr>
-        <w:t>tte ich noch</w:t>
-      </w:r>
-    </w:p>
-    <w:p>
-      <w:pPr>
-        <w:pStyle w:val="style179"/>
-        <w:numPr>
-          <w:ilvl w:val="0"/>
-          <w:numId w:val="3"/>
-        </w:numPr>
-        <w:rPr/>
-      </w:pPr>
-      <w:r>
-        <w:rPr>
-          <w:lang w:val="en-US"/>
-        </w:rPr>
-        <w:t>??</w:t>
-      </w:r>
-      <w:r>
-        <w:rPr>
-          <w:lang w:val="en-US"/>
+        <w:t>Schiedsrichterseminar (wollte J</w:t>
+      </w:r>
+      <w:r>
+        <w:rPr>
+          <w:lang w:val="de-DE"/>
+        </w:rPr>
+        <w:t>ü</w:t>
+      </w:r>
+      <w:r>
+        <w:rPr>
+          <w:lang w:val="de-DE"/>
+        </w:rPr>
+        <w:t xml:space="preserve">rgen eigentlich schon dieses Jahr </w:t>
+      </w:r>
+      <w:r>
+        <w:rPr>
+          <w:lang w:val="de-DE"/>
         </w:rPr>
         <w:tab/>
       </w:r>
       <w:r>
         <w:rPr>
-          <w:lang w:val="en-US"/>
+          <w:lang w:val="de-DE"/>
         </w:rPr>
         <w:tab/>
-      </w:r>
-      <w:r>
-        <w:rPr>
-          <w:lang w:val="en-US"/>
-        </w:rPr>
-        <w:t>Schiedsrichterseminar (wollte J</w:t>
-      </w:r>
-      <w:r>
-        <w:rPr>
-          <w:lang w:val="de-DE"/>
-        </w:rPr>
-        <w:t>ü</w:t>
-      </w:r>
-      <w:r>
-        <w:rPr>
-          <w:lang w:val="en-US"/>
-        </w:rPr>
-        <w:t xml:space="preserve">rgen eigentlich schon dieses Jahr </w:t>
-      </w:r>
-      <w:r>
-        <w:rPr>
-          <w:lang w:val="en-US"/>
-        </w:rPr>
-        <w:tab/>
-      </w:r>
-      <w:r>
-        <w:rPr>
-          <w:lang w:val="en-US"/>
-        </w:rPr>
-        <w:tab/>
-      </w:r>
-      <w:r>
-        <w:rPr>
-          <w:lang w:val="en-US"/>
-        </w:rPr>
         <w:t>anbieten)</w:t>
       </w:r>
     </w:p>
     <w:sectPr>
-      <w:pgSz w:w="12240" w:h="15840" w:orient="portrait"/>
+      <w:headerReference w:type="even" r:id="rId7"/>
+      <w:headerReference w:type="default" r:id="rId8"/>
+      <w:headerReference w:type="first" r:id="rId9"/>
+      <w:pgSz w:w="12240" w:h="15840"/>
       <w:pgMar w:top="1440" w:right="1440" w:bottom="1440" w:left="1440" w:header="720" w:footer="720" w:gutter="0"/>
       <w:cols w:space="720"/>
       <w:docGrid w:linePitch="360"/>
@@ -1479,10 +1383,89 @@
 </w:document>
 </file>
 
+<file path=word/endnotes.xml><?xml version="1.0" encoding="utf-8"?>
+<w:endnotes xmlns:wpc="http://schemas.microsoft.com/office/word/2010/wordprocessingCanvas" xmlns:cx="http://schemas.microsoft.com/office/drawing/2014/chartex" xmlns:cx1="http://schemas.microsoft.com/office/drawing/2015/9/8/chartex" xmlns:cx2="http://schemas.microsoft.com/office/drawing/2015/10/21/chartex" xmlns:cx3="http://schemas.microsoft.com/office/drawing/2016/5/9/chartex" xmlns:cx4="http://schemas.microsoft.com/office/drawing/2016/5/10/chartex" xmlns:cx5="http://schemas.microsoft.com/office/drawing/2016/5/11/chartex" xmlns:cx6="http://schemas.microsoft.com/office/drawing/2016/5/12/chartex" xmlns:cx7="http://schemas.microsoft.com/office/drawing/2016/5/13/chartex" xmlns:cx8="http://schemas.microsoft.com/office/drawing/2016/5/14/chartex" xmlns:mc="http://schemas.openxmlformats.org/markup-compatibility/2006" xmlns:aink="http://schemas.microsoft.com/office/drawing/2016/ink" xmlns:am3d="http://schemas.microsoft.com/office/drawing/2017/model3d" xmlns:o="urn:schemas-microsoft-com:office:office" xmlns:oel="http://schemas.microsoft.com/office/2019/extlst" xmlns:r="http://schemas.openxmlformats.org/officeDocument/2006/relationships" xmlns:m="http://schemas.openxmlformats.org/officeDocument/2006/math" xmlns:v="urn:schemas-microsoft-com:vml" xmlns:wp14="http://schemas.microsoft.com/office/word/2010/wordprocessingDrawing" xmlns:wp="http://schemas.openxmlformats.org/drawingml/2006/wordprocessingDrawing" xmlns:w10="urn:schemas-microsoft-com:office:word" xmlns:w="http://schemas.openxmlformats.org/wordprocessingml/2006/main" xmlns:w14="http://schemas.microsoft.com/office/word/2010/wordml" xmlns:w15="http://schemas.microsoft.com/office/word/2012/wordml" xmlns:w16cex="http://schemas.microsoft.com/office/word/2018/wordml/cex" xmlns:w16cid="http://schemas.microsoft.com/office/word/2016/wordml/cid" xmlns:w16="http://schemas.microsoft.com/office/word/2018/wordml" xmlns:w16du="http://schemas.microsoft.com/office/word/2023/wordml/word16du" xmlns:w16sdtdh="http://schemas.microsoft.com/office/word/2020/wordml/sdtdatahash" xmlns:w16sdtfl="http://schemas.microsoft.com/office/word/2024/wordml/sdtformatlock" xmlns:w16se="http://schemas.microsoft.com/office/word/2015/wordml/symex" xmlns:wpg="http://schemas.microsoft.com/office/word/2010/wordprocessingGroup" xmlns:wpi="http://schemas.microsoft.com/office/word/2010/wordprocessingInk" xmlns:wne="http://schemas.microsoft.com/office/word/2006/wordml" xmlns:wps="http://schemas.microsoft.com/office/word/2010/wordprocessingShape" mc:Ignorable="w14 w15 w16se w16cid w16 w16cex w16sdtdh w16sdtfl w16du wp14">
+  <w:endnote w:type="separator" w:id="-1">
+    <w:p>
+      <w:pPr>
+        <w:spacing w:after="0" w:line="240" w:lineRule="auto"/>
+      </w:pPr>
+      <w:r>
+        <w:separator/>
+      </w:r>
+    </w:p>
+  </w:endnote>
+  <w:endnote w:type="continuationSeparator" w:id="0">
+    <w:p>
+      <w:pPr>
+        <w:spacing w:after="0" w:line="240" w:lineRule="auto"/>
+      </w:pPr>
+      <w:r>
+        <w:continuationSeparator/>
+      </w:r>
+    </w:p>
+  </w:endnote>
+</w:endnotes>
+</file>
+
+<file path=word/footnotes.xml><?xml version="1.0" encoding="utf-8"?>
+<w:footnotes xmlns:wpc="http://schemas.microsoft.com/office/word/2010/wordprocessingCanvas" xmlns:cx="http://schemas.microsoft.com/office/drawing/2014/chartex" xmlns:cx1="http://schemas.microsoft.com/office/drawing/2015/9/8/chartex" xmlns:cx2="http://schemas.microsoft.com/office/drawing/2015/10/21/chartex" xmlns:cx3="http://schemas.microsoft.com/office/drawing/2016/5/9/chartex" xmlns:cx4="http://schemas.microsoft.com/office/drawing/2016/5/10/chartex" xmlns:cx5="http://schemas.microsoft.com/office/drawing/2016/5/11/chartex" xmlns:cx6="http://schemas.microsoft.com/office/drawing/2016/5/12/chartex" xmlns:cx7="http://schemas.microsoft.com/office/drawing/2016/5/13/chartex" xmlns:cx8="http://schemas.microsoft.com/office/drawing/2016/5/14/chartex" xmlns:mc="http://schemas.openxmlformats.org/markup-compatibility/2006" xmlns:aink="http://schemas.microsoft.com/office/drawing/2016/ink" xmlns:am3d="http://schemas.microsoft.com/office/drawing/2017/model3d" xmlns:o="urn:schemas-microsoft-com:office:office" xmlns:oel="http://schemas.microsoft.com/office/2019/extlst" xmlns:r="http://schemas.openxmlformats.org/officeDocument/2006/relationships" xmlns:m="http://schemas.openxmlformats.org/officeDocument/2006/math" xmlns:v="urn:schemas-microsoft-com:vml" xmlns:wp14="http://schemas.microsoft.com/office/word/2010/wordprocessingDrawing" xmlns:wp="http://schemas.openxmlformats.org/drawingml/2006/wordprocessingDrawing" xmlns:w10="urn:schemas-microsoft-com:office:word" xmlns:w="http://schemas.openxmlformats.org/wordprocessingml/2006/main" xmlns:w14="http://schemas.microsoft.com/office/word/2010/wordml" xmlns:w15="http://schemas.microsoft.com/office/word/2012/wordml" xmlns:w16cex="http://schemas.microsoft.com/office/word/2018/wordml/cex" xmlns:w16cid="http://schemas.microsoft.com/office/word/2016/wordml/cid" xmlns:w16="http://schemas.microsoft.com/office/word/2018/wordml" xmlns:w16du="http://schemas.microsoft.com/office/word/2023/wordml/word16du" xmlns:w16sdtdh="http://schemas.microsoft.com/office/word/2020/wordml/sdtdatahash" xmlns:w16sdtfl="http://schemas.microsoft.com/office/word/2024/wordml/sdtformatlock" xmlns:w16se="http://schemas.microsoft.com/office/word/2015/wordml/symex" xmlns:wpg="http://schemas.microsoft.com/office/word/2010/wordprocessingGroup" xmlns:wpi="http://schemas.microsoft.com/office/word/2010/wordprocessingInk" xmlns:wne="http://schemas.microsoft.com/office/word/2006/wordml" xmlns:wps="http://schemas.microsoft.com/office/word/2010/wordprocessingShape" mc:Ignorable="w14 w15 w16se w16cid w16 w16cex w16sdtdh w16sdtfl w16du wp14">
+  <w:footnote w:type="separator" w:id="-1">
+    <w:p>
+      <w:pPr>
+        <w:spacing w:after="0" w:line="240" w:lineRule="auto"/>
+      </w:pPr>
+      <w:r>
+        <w:separator/>
+      </w:r>
+    </w:p>
+  </w:footnote>
+  <w:footnote w:type="continuationSeparator" w:id="0">
+    <w:p>
+      <w:pPr>
+        <w:spacing w:after="0" w:line="240" w:lineRule="auto"/>
+      </w:pPr>
+      <w:r>
+        <w:continuationSeparator/>
+      </w:r>
+    </w:p>
+  </w:footnote>
+</w:footnotes>
+</file>
+
+<file path=word/header1.xml><?xml version="1.0" encoding="utf-8"?>
+<w:hdr xmlns:wpc="http://schemas.microsoft.com/office/word/2010/wordprocessingCanvas" xmlns:cx="http://schemas.microsoft.com/office/drawing/2014/chartex" xmlns:cx1="http://schemas.microsoft.com/office/drawing/2015/9/8/chartex" xmlns:cx2="http://schemas.microsoft.com/office/drawing/2015/10/21/chartex" xmlns:cx3="http://schemas.microsoft.com/office/drawing/2016/5/9/chartex" xmlns:cx4="http://schemas.microsoft.com/office/drawing/2016/5/10/chartex" xmlns:cx5="http://schemas.microsoft.com/office/drawing/2016/5/11/chartex" xmlns:cx6="http://schemas.microsoft.com/office/drawing/2016/5/12/chartex" xmlns:cx7="http://schemas.microsoft.com/office/drawing/2016/5/13/chartex" xmlns:cx8="http://schemas.microsoft.com/office/drawing/2016/5/14/chartex" xmlns:mc="http://schemas.openxmlformats.org/markup-compatibility/2006" xmlns:aink="http://schemas.microsoft.com/office/drawing/2016/ink" xmlns:am3d="http://schemas.microsoft.com/office/drawing/2017/model3d" xmlns:o="urn:schemas-microsoft-com:office:office" xmlns:oel="http://schemas.microsoft.com/office/2019/extlst" xmlns:r="http://schemas.openxmlformats.org/officeDocument/2006/relationships" xmlns:m="http://schemas.openxmlformats.org/officeDocument/2006/math" xmlns:v="urn:schemas-microsoft-com:vml" xmlns:wp14="http://schemas.microsoft.com/office/word/2010/wordprocessingDrawing" xmlns:wp="http://schemas.openxmlformats.org/drawingml/2006/wordprocessingDrawing" xmlns:w10="urn:schemas-microsoft-com:office:word" xmlns:w="http://schemas.openxmlformats.org/wordprocessingml/2006/main" xmlns:w14="http://schemas.microsoft.com/office/word/2010/wordml" xmlns:w15="http://schemas.microsoft.com/office/word/2012/wordml" xmlns:w16cex="http://schemas.microsoft.com/office/word/2018/wordml/cex" xmlns:w16cid="http://schemas.microsoft.com/office/word/2016/wordml/cid" xmlns:w16="http://schemas.microsoft.com/office/word/2018/wordml" xmlns:w16du="http://schemas.microsoft.com/office/word/2023/wordml/word16du" xmlns:w16sdtdh="http://schemas.microsoft.com/office/word/2020/wordml/sdtdatahash" xmlns:w16sdtfl="http://schemas.microsoft.com/office/word/2024/wordml/sdtformatlock" xmlns:w16se="http://schemas.microsoft.com/office/word/2015/wordml/symex" xmlns:wpg="http://schemas.microsoft.com/office/word/2010/wordprocessingGroup" xmlns:wpi="http://schemas.microsoft.com/office/word/2010/wordprocessingInk" xmlns:wne="http://schemas.microsoft.com/office/word/2006/wordml" xmlns:wps="http://schemas.microsoft.com/office/word/2010/wordprocessingShape" mc:Ignorable="w14 w15 w16se w16cid w16 w16cex w16sdtdh w16sdtfl w16du wp14">
+  <w:p>
+    <w:pPr>
+      <w:pStyle w:val="Kopfzeile"/>
+    </w:pPr>
+  </w:p>
+</w:hdr>
+</file>
+
+<file path=word/header2.xml><?xml version="1.0" encoding="utf-8"?>
+<w:hdr xmlns:wpc="http://schemas.microsoft.com/office/word/2010/wordprocessingCanvas" xmlns:cx="http://schemas.microsoft.com/office/drawing/2014/chartex" xmlns:cx1="http://schemas.microsoft.com/office/drawing/2015/9/8/chartex" xmlns:cx2="http://schemas.microsoft.com/office/drawing/2015/10/21/chartex" xmlns:cx3="http://schemas.microsoft.com/office/drawing/2016/5/9/chartex" xmlns:cx4="http://schemas.microsoft.com/office/drawing/2016/5/10/chartex" xmlns:cx5="http://schemas.microsoft.com/office/drawing/2016/5/11/chartex" xmlns:cx6="http://schemas.microsoft.com/office/drawing/2016/5/12/chartex" xmlns:cx7="http://schemas.microsoft.com/office/drawing/2016/5/13/chartex" xmlns:cx8="http://schemas.microsoft.com/office/drawing/2016/5/14/chartex" xmlns:mc="http://schemas.openxmlformats.org/markup-compatibility/2006" xmlns:aink="http://schemas.microsoft.com/office/drawing/2016/ink" xmlns:am3d="http://schemas.microsoft.com/office/drawing/2017/model3d" xmlns:o="urn:schemas-microsoft-com:office:office" xmlns:oel="http://schemas.microsoft.com/office/2019/extlst" xmlns:r="http://schemas.openxmlformats.org/officeDocument/2006/relationships" xmlns:m="http://schemas.openxmlformats.org/officeDocument/2006/math" xmlns:v="urn:schemas-microsoft-com:vml" xmlns:wp14="http://schemas.microsoft.com/office/word/2010/wordprocessingDrawing" xmlns:wp="http://schemas.openxmlformats.org/drawingml/2006/wordprocessingDrawing" xmlns:w10="urn:schemas-microsoft-com:office:word" xmlns:w="http://schemas.openxmlformats.org/wordprocessingml/2006/main" xmlns:w14="http://schemas.microsoft.com/office/word/2010/wordml" xmlns:w15="http://schemas.microsoft.com/office/word/2012/wordml" xmlns:w16cex="http://schemas.microsoft.com/office/word/2018/wordml/cex" xmlns:w16cid="http://schemas.microsoft.com/office/word/2016/wordml/cid" xmlns:w16="http://schemas.microsoft.com/office/word/2018/wordml" xmlns:w16du="http://schemas.microsoft.com/office/word/2023/wordml/word16du" xmlns:w16sdtdh="http://schemas.microsoft.com/office/word/2020/wordml/sdtdatahash" xmlns:w16sdtfl="http://schemas.microsoft.com/office/word/2024/wordml/sdtformatlock" xmlns:w16se="http://schemas.microsoft.com/office/word/2015/wordml/symex" xmlns:wpg="http://schemas.microsoft.com/office/word/2010/wordprocessingGroup" xmlns:wpi="http://schemas.microsoft.com/office/word/2010/wordprocessingInk" xmlns:wne="http://schemas.microsoft.com/office/word/2006/wordml" xmlns:wps="http://schemas.microsoft.com/office/word/2010/wordprocessingShape" mc:Ignorable="w14 w15 w16se w16cid w16 w16cex w16sdtdh w16sdtfl w16du wp14">
+  <w:p>
+    <w:pPr>
+      <w:pStyle w:val="Kopfzeile"/>
+    </w:pPr>
+  </w:p>
+</w:hdr>
+</file>
+
+<file path=word/header3.xml><?xml version="1.0" encoding="utf-8"?>
+<w:hdr xmlns:wpc="http://schemas.microsoft.com/office/word/2010/wordprocessingCanvas" xmlns:cx="http://schemas.microsoft.com/office/drawing/2014/chartex" xmlns:cx1="http://schemas.microsoft.com/office/drawing/2015/9/8/chartex" xmlns:cx2="http://schemas.microsoft.com/office/drawing/2015/10/21/chartex" xmlns:cx3="http://schemas.microsoft.com/office/drawing/2016/5/9/chartex" xmlns:cx4="http://schemas.microsoft.com/office/drawing/2016/5/10/chartex" xmlns:cx5="http://schemas.microsoft.com/office/drawing/2016/5/11/chartex" xmlns:cx6="http://schemas.microsoft.com/office/drawing/2016/5/12/chartex" xmlns:cx7="http://schemas.microsoft.com/office/drawing/2016/5/13/chartex" xmlns:cx8="http://schemas.microsoft.com/office/drawing/2016/5/14/chartex" xmlns:mc="http://schemas.openxmlformats.org/markup-compatibility/2006" xmlns:aink="http://schemas.microsoft.com/office/drawing/2016/ink" xmlns:am3d="http://schemas.microsoft.com/office/drawing/2017/model3d" xmlns:o="urn:schemas-microsoft-com:office:office" xmlns:oel="http://schemas.microsoft.com/office/2019/extlst" xmlns:r="http://schemas.openxmlformats.org/officeDocument/2006/relationships" xmlns:m="http://schemas.openxmlformats.org/officeDocument/2006/math" xmlns:v="urn:schemas-microsoft-com:vml" xmlns:wp14="http://schemas.microsoft.com/office/word/2010/wordprocessingDrawing" xmlns:wp="http://schemas.openxmlformats.org/drawingml/2006/wordprocessingDrawing" xmlns:w10="urn:schemas-microsoft-com:office:word" xmlns:w="http://schemas.openxmlformats.org/wordprocessingml/2006/main" xmlns:w14="http://schemas.microsoft.com/office/word/2010/wordml" xmlns:w15="http://schemas.microsoft.com/office/word/2012/wordml" xmlns:w16cex="http://schemas.microsoft.com/office/word/2018/wordml/cex" xmlns:w16cid="http://schemas.microsoft.com/office/word/2016/wordml/cid" xmlns:w16="http://schemas.microsoft.com/office/word/2018/wordml" xmlns:w16du="http://schemas.microsoft.com/office/word/2023/wordml/word16du" xmlns:w16sdtdh="http://schemas.microsoft.com/office/word/2020/wordml/sdtdatahash" xmlns:w16sdtfl="http://schemas.microsoft.com/office/word/2024/wordml/sdtformatlock" xmlns:w16se="http://schemas.microsoft.com/office/word/2015/wordml/symex" xmlns:wpg="http://schemas.microsoft.com/office/word/2010/wordprocessingGroup" xmlns:wpi="http://schemas.microsoft.com/office/word/2010/wordprocessingInk" xmlns:wne="http://schemas.microsoft.com/office/word/2006/wordml" xmlns:wps="http://schemas.microsoft.com/office/word/2010/wordprocessingShape" mc:Ignorable="w14 w15 w16se w16cid w16 w16cex w16sdtdh w16sdtfl w16du wp14">
+  <w:p>
+    <w:pPr>
+      <w:pStyle w:val="Kopfzeile"/>
+    </w:pPr>
+  </w:p>
+</w:hdr>
+</file>
+
 <file path=word/numbering.xml><?xml version="1.0" encoding="utf-8"?>
-<w:numbering xmlns:wpc="http://schemas.microsoft.com/office/word/2010/wordprocessingCanvas" xmlns:mc="http://schemas.openxmlformats.org/markup-compatibility/2006" xmlns:o="urn:schemas-microsoft-com:office:office" xmlns:r="http://schemas.openxmlformats.org/package/2006/relationships" xmlns:m="http://schemas.openxmlformats.org/officeDocument/2006/math" xmlns:v="urn:schemas-microsoft-com:vml" xmlns:wp14="http://schemas.microsoft.com/office/word/2010/wordprocessingDrawing" xmlns:wp="http://schemas.openxmlformats.org/drawingml/2006/wordprocessingDrawing" xmlns:w10="urn:schemas-microsoft-com:office:word" xmlns:w="http://schemas.openxmlformats.org/wordprocessingml/2006/main" xmlns:w14="http://schemas.microsoft.com/office/word/2010/wordml" xmlns:wpg="http://schemas.microsoft.com/office/word/2010/wordprocessingGroup" xmlns:wpi="http://schemas.microsoft.com/office/word/2010/wordprocessingInk" xmlns:wne="http://schemas.microsoft.com/office/word/2006/wordml" xmlns:wps="http://schemas.microsoft.com/office/word/2010/wordprocessingShape" mc:Ignorable="w14 wp14">
-  <w:abstractNum w:abstractNumId="0">
-    <w:nsid w:val="00000000"/>
+<w:numbering xmlns:wpc="http://schemas.microsoft.com/office/word/2010/wordprocessingCanvas" xmlns:cx="http://schemas.microsoft.com/office/drawing/2014/chartex" xmlns:cx1="http://schemas.microsoft.com/office/drawing/2015/9/8/chartex" xmlns:cx2="http://schemas.microsoft.com/office/drawing/2015/10/21/chartex" xmlns:cx3="http://schemas.microsoft.com/office/drawing/2016/5/9/chartex" xmlns:cx4="http://schemas.microsoft.com/office/drawing/2016/5/10/chartex" xmlns:cx5="http://schemas.microsoft.com/office/drawing/2016/5/11/chartex" xmlns:cx6="http://schemas.microsoft.com/office/drawing/2016/5/12/chartex" xmlns:cx7="http://schemas.microsoft.com/office/drawing/2016/5/13/chartex" xmlns:cx8="http://schemas.microsoft.com/office/drawing/2016/5/14/chartex" xmlns:mc="http://schemas.openxmlformats.org/markup-compatibility/2006" xmlns:aink="http://schemas.microsoft.com/office/drawing/2016/ink" xmlns:am3d="http://schemas.microsoft.com/office/drawing/2017/model3d" xmlns:o="urn:schemas-microsoft-com:office:office" xmlns:oel="http://schemas.microsoft.com/office/2019/extlst" xmlns:r="http://schemas.openxmlformats.org/officeDocument/2006/relationships" xmlns:m="http://schemas.openxmlformats.org/officeDocument/2006/math" xmlns:v="urn:schemas-microsoft-com:vml" xmlns:wp14="http://schemas.microsoft.com/office/word/2010/wordprocessingDrawing" xmlns:wp="http://schemas.openxmlformats.org/drawingml/2006/wordprocessingDrawing" xmlns:w10="urn:schemas-microsoft-com:office:word" xmlns:w="http://schemas.openxmlformats.org/wordprocessingml/2006/main" xmlns:w14="http://schemas.microsoft.com/office/word/2010/wordml" xmlns:w15="http://schemas.microsoft.com/office/word/2012/wordml" xmlns:w16cex="http://schemas.microsoft.com/office/word/2018/wordml/cex" xmlns:w16cid="http://schemas.microsoft.com/office/word/2016/wordml/cid" xmlns:w16="http://schemas.microsoft.com/office/word/2018/wordml" xmlns:w16du="http://schemas.microsoft.com/office/word/2023/wordml/word16du" xmlns:w16sdtdh="http://schemas.microsoft.com/office/word/2020/wordml/sdtdatahash" xmlns:w16sdtfl="http://schemas.microsoft.com/office/word/2024/wordml/sdtformatlock" xmlns:w16se="http://schemas.microsoft.com/office/word/2015/wordml/symex" xmlns:wpg="http://schemas.microsoft.com/office/word/2010/wordprocessingGroup" xmlns:wpi="http://schemas.microsoft.com/office/word/2010/wordprocessingInk" xmlns:wne="http://schemas.microsoft.com/office/word/2006/wordml" xmlns:wps="http://schemas.microsoft.com/office/word/2010/wordprocessingShape" mc:Ignorable="w14 w15 w16se w16cid w16 w16cex w16sdtdh w16sdtfl w16du wp14">
+  <w:abstractNum w:abstractNumId="0" w15:restartNumberingAfterBreak="0">
     <w:multiLevelType w:val="hybridMultilevel"/>
     <w:tmpl w:val="00000000"/>
     <w:lvl w:ilvl="0" w:tplc="04090001">
@@ -1506,7 +1489,7 @@
         <w:ind w:left="1440" w:hanging="360"/>
       </w:pPr>
       <w:rPr>
-        <w:rFonts w:ascii="Courier New" w:cs="Courier New" w:hAnsi="Courier New" w:hint="default"/>
+        <w:rFonts w:ascii="Courier New" w:hAnsi="Courier New" w:cs="Courier New" w:hint="default"/>
       </w:rPr>
     </w:lvl>
     <w:lvl w:ilvl="2" w:tplc="04090005" w:tentative="1">
@@ -1542,7 +1525,7 @@
         <w:ind w:left="3600" w:hanging="360"/>
       </w:pPr>
       <w:rPr>
-        <w:rFonts w:ascii="Courier New" w:cs="Courier New" w:hAnsi="Courier New" w:hint="default"/>
+        <w:rFonts w:ascii="Courier New" w:hAnsi="Courier New" w:cs="Courier New" w:hint="default"/>
       </w:rPr>
     </w:lvl>
     <w:lvl w:ilvl="5" w:tplc="04090005" w:tentative="1">
@@ -1578,7 +1561,7 @@
         <w:ind w:left="5760" w:hanging="360"/>
       </w:pPr>
       <w:rPr>
-        <w:rFonts w:ascii="Courier New" w:cs="Courier New" w:hAnsi="Courier New" w:hint="default"/>
+        <w:rFonts w:ascii="Courier New" w:hAnsi="Courier New" w:cs="Courier New" w:hint="default"/>
       </w:rPr>
     </w:lvl>
     <w:lvl w:ilvl="8" w:tplc="04090005" w:tentative="1">
@@ -1594,7 +1577,7 @@
       </w:rPr>
     </w:lvl>
   </w:abstractNum>
-  <w:abstractNum w:abstractNumId="1">
+  <w:abstractNum w:abstractNumId="1" w15:restartNumberingAfterBreak="0">
     <w:nsid w:val="00000001"/>
     <w:multiLevelType w:val="hybridMultilevel"/>
     <w:tmpl w:val="00000000"/>
@@ -1619,7 +1602,7 @@
         <w:ind w:left="1440" w:hanging="360"/>
       </w:pPr>
       <w:rPr>
-        <w:rFonts w:ascii="Courier New" w:cs="Courier New" w:hAnsi="Courier New" w:hint="default"/>
+        <w:rFonts w:ascii="Courier New" w:hAnsi="Courier New" w:cs="Courier New" w:hint="default"/>
       </w:rPr>
     </w:lvl>
     <w:lvl w:ilvl="2" w:tplc="04090005" w:tentative="1">
@@ -1655,7 +1638,7 @@
         <w:ind w:left="3600" w:hanging="360"/>
       </w:pPr>
       <w:rPr>
-        <w:rFonts w:ascii="Courier New" w:cs="Courier New" w:hAnsi="Courier New" w:hint="default"/>
+        <w:rFonts w:ascii="Courier New" w:hAnsi="Courier New" w:cs="Courier New" w:hint="default"/>
       </w:rPr>
     </w:lvl>
     <w:lvl w:ilvl="5" w:tplc="04090005" w:tentative="1">
@@ -1691,7 +1674,7 @@
         <w:ind w:left="5760" w:hanging="360"/>
       </w:pPr>
       <w:rPr>
-        <w:rFonts w:ascii="Courier New" w:cs="Courier New" w:hAnsi="Courier New" w:hint="default"/>
+        <w:rFonts w:ascii="Courier New" w:hAnsi="Courier New" w:cs="Courier New" w:hint="default"/>
       </w:rPr>
     </w:lvl>
     <w:lvl w:ilvl="8" w:tplc="04090005" w:tentative="1">
@@ -1707,7 +1690,7 @@
       </w:rPr>
     </w:lvl>
   </w:abstractNum>
-  <w:abstractNum w:abstractNumId="2">
+  <w:abstractNum w:abstractNumId="2" w15:restartNumberingAfterBreak="0">
     <w:nsid w:val="00000002"/>
     <w:multiLevelType w:val="hybridMultilevel"/>
     <w:tmpl w:val="00000000"/>
@@ -1732,7 +1715,7 @@
         <w:ind w:left="1440" w:hanging="360"/>
       </w:pPr>
       <w:rPr>
-        <w:rFonts w:ascii="Courier New" w:cs="Courier New" w:hAnsi="Courier New" w:hint="default"/>
+        <w:rFonts w:ascii="Courier New" w:hAnsi="Courier New" w:cs="Courier New" w:hint="default"/>
       </w:rPr>
     </w:lvl>
     <w:lvl w:ilvl="2" w:tplc="04090005">
@@ -1768,7 +1751,7 @@
         <w:ind w:left="3600" w:hanging="360"/>
       </w:pPr>
       <w:rPr>
-        <w:rFonts w:ascii="Courier New" w:cs="Courier New" w:hAnsi="Courier New" w:hint="default"/>
+        <w:rFonts w:ascii="Courier New" w:hAnsi="Courier New" w:cs="Courier New" w:hint="default"/>
       </w:rPr>
     </w:lvl>
     <w:lvl w:ilvl="5" w:tplc="04090005" w:tentative="1">
@@ -1804,7 +1787,7 @@
         <w:ind w:left="5760" w:hanging="360"/>
       </w:pPr>
       <w:rPr>
-        <w:rFonts w:ascii="Courier New" w:cs="Courier New" w:hAnsi="Courier New" w:hint="default"/>
+        <w:rFonts w:ascii="Courier New" w:hAnsi="Courier New" w:cs="Courier New" w:hint="default"/>
       </w:rPr>
     </w:lvl>
     <w:lvl w:ilvl="8" w:tplc="04090005" w:tentative="1">
@@ -1820,55 +1803,430 @@
       </w:rPr>
     </w:lvl>
   </w:abstractNum>
-  <w:num w:numId="1">
+  <w:num w:numId="1" w16cid:durableId="561792825">
     <w:abstractNumId w:val="0"/>
   </w:num>
-  <w:num w:numId="2">
+  <w:num w:numId="2" w16cid:durableId="2134596336">
     <w:abstractNumId w:val="1"/>
   </w:num>
-  <w:num w:numId="3">
+  <w:num w:numId="3" w16cid:durableId="1776293110">
     <w:abstractNumId w:val="2"/>
   </w:num>
 </w:numbering>
 </file>
 
 <file path=word/styles.xml><?xml version="1.0" encoding="utf-8"?>
-<w:styles xmlns:mc="http://schemas.openxmlformats.org/markup-compatibility/2006" xmlns:w="http://schemas.openxmlformats.org/wordprocessingml/2006/main" xmlns:w14="http://schemas.microsoft.com/office/word/2010/wordml" mc:Ignorable="w14">
+<w:styles xmlns:mc="http://schemas.openxmlformats.org/markup-compatibility/2006" xmlns:r="http://schemas.openxmlformats.org/officeDocument/2006/relationships" xmlns:w="http://schemas.openxmlformats.org/wordprocessingml/2006/main" xmlns:w14="http://schemas.microsoft.com/office/word/2010/wordml" xmlns:w15="http://schemas.microsoft.com/office/word/2012/wordml" xmlns:w16cex="http://schemas.microsoft.com/office/word/2018/wordml/cex" xmlns:w16cid="http://schemas.microsoft.com/office/word/2016/wordml/cid" xmlns:w16="http://schemas.microsoft.com/office/word/2018/wordml" xmlns:w16du="http://schemas.microsoft.com/office/word/2023/wordml/word16du" xmlns:w16sdtdh="http://schemas.microsoft.com/office/word/2020/wordml/sdtdatahash" xmlns:w16sdtfl="http://schemas.microsoft.com/office/word/2024/wordml/sdtformatlock" xmlns:w16se="http://schemas.microsoft.com/office/word/2015/wordml/symex" mc:Ignorable="w14 w15 w16se w16cid w16 w16cex w16sdtdh w16sdtfl w16du">
   <w:docDefaults>
     <w:rPrDefault>
       <w:rPr>
-        <w:rFonts w:ascii="Calibri" w:cs="Times New Roman" w:eastAsia="宋体" w:hAnsi="Calibri"/>
-        <w:lang w:val="en-US" w:bidi="ar-SA" w:eastAsia="zh-CN"/>
+        <w:rFonts w:ascii="Calibri" w:eastAsia="SimSun" w:hAnsi="Calibri" w:cs="Times New Roman"/>
+        <w:lang w:val="de-DE" w:eastAsia="de-DE" w:bidi="ar-SA"/>
       </w:rPr>
     </w:rPrDefault>
-    <w:pPrDefault>
-      <w:pPr/>
-    </w:pPrDefault>
+    <w:pPrDefault/>
   </w:docDefaults>
-  <w:style w:type="paragraph" w:default="1" w:styleId="style0">
+  <w:latentStyles w:defLockedState="0" w:defUIPriority="99" w:defSemiHidden="0" w:defUnhideWhenUsed="0" w:defQFormat="0" w:count="376">
+    <w:lsdException w:name="Normal" w:uiPriority="0" w:qFormat="1"/>
+    <w:lsdException w:name="heading 1" w:uiPriority="9" w:qFormat="1"/>
+    <w:lsdException w:name="heading 2" w:semiHidden="1" w:uiPriority="9" w:unhideWhenUsed="1" w:qFormat="1"/>
+    <w:lsdException w:name="heading 3" w:semiHidden="1" w:uiPriority="9" w:unhideWhenUsed="1" w:qFormat="1"/>
+    <w:lsdException w:name="heading 4" w:semiHidden="1" w:uiPriority="9" w:unhideWhenUsed="1" w:qFormat="1"/>
+    <w:lsdException w:name="heading 5" w:semiHidden="1" w:uiPriority="9" w:unhideWhenUsed="1" w:qFormat="1"/>
+    <w:lsdException w:name="heading 6" w:semiHidden="1" w:uiPriority="9" w:unhideWhenUsed="1" w:qFormat="1"/>
+    <w:lsdException w:name="heading 7" w:semiHidden="1" w:uiPriority="9" w:unhideWhenUsed="1" w:qFormat="1"/>
+    <w:lsdException w:name="heading 8" w:semiHidden="1" w:uiPriority="9" w:unhideWhenUsed="1" w:qFormat="1"/>
+    <w:lsdException w:name="heading 9" w:semiHidden="1" w:uiPriority="9" w:unhideWhenUsed="1" w:qFormat="1"/>
+    <w:lsdException w:name="index 1" w:semiHidden="1" w:unhideWhenUsed="1"/>
+    <w:lsdException w:name="index 2" w:semiHidden="1" w:unhideWhenUsed="1"/>
+    <w:lsdException w:name="index 3" w:semiHidden="1" w:unhideWhenUsed="1"/>
+    <w:lsdException w:name="index 4" w:semiHidden="1" w:unhideWhenUsed="1"/>
+    <w:lsdException w:name="index 5" w:semiHidden="1" w:unhideWhenUsed="1"/>
+    <w:lsdException w:name="index 6" w:semiHidden="1" w:unhideWhenUsed="1"/>
+    <w:lsdException w:name="index 7" w:semiHidden="1" w:unhideWhenUsed="1"/>
+    <w:lsdException w:name="index 8" w:semiHidden="1" w:unhideWhenUsed="1"/>
+    <w:lsdException w:name="index 9" w:semiHidden="1" w:unhideWhenUsed="1"/>
+    <w:lsdException w:name="toc 1" w:semiHidden="1" w:uiPriority="39" w:unhideWhenUsed="1"/>
+    <w:lsdException w:name="toc 2" w:semiHidden="1" w:uiPriority="39" w:unhideWhenUsed="1"/>
+    <w:lsdException w:name="toc 3" w:semiHidden="1" w:uiPriority="39" w:unhideWhenUsed="1"/>
+    <w:lsdException w:name="toc 4" w:semiHidden="1" w:uiPriority="39" w:unhideWhenUsed="1"/>
+    <w:lsdException w:name="toc 5" w:semiHidden="1" w:uiPriority="39" w:unhideWhenUsed="1"/>
+    <w:lsdException w:name="toc 6" w:semiHidden="1" w:uiPriority="39" w:unhideWhenUsed="1"/>
+    <w:lsdException w:name="toc 7" w:semiHidden="1" w:uiPriority="39" w:unhideWhenUsed="1"/>
+    <w:lsdException w:name="toc 8" w:semiHidden="1" w:uiPriority="39" w:unhideWhenUsed="1"/>
+    <w:lsdException w:name="toc 9" w:semiHidden="1" w:uiPriority="39" w:unhideWhenUsed="1"/>
+    <w:lsdException w:name="Normal Indent" w:semiHidden="1" w:unhideWhenUsed="1"/>
+    <w:lsdException w:name="footnote text" w:semiHidden="1" w:unhideWhenUsed="1"/>
+    <w:lsdException w:name="annotation text" w:semiHidden="1" w:unhideWhenUsed="1"/>
+    <w:lsdException w:name="header" w:semiHidden="1" w:unhideWhenUsed="1"/>
+    <w:lsdException w:name="footer" w:semiHidden="1" w:unhideWhenUsed="1"/>
+    <w:lsdException w:name="index heading" w:semiHidden="1" w:unhideWhenUsed="1"/>
+    <w:lsdException w:name="caption" w:semiHidden="1" w:uiPriority="35" w:unhideWhenUsed="1" w:qFormat="1"/>
+    <w:lsdException w:name="table of figures" w:semiHidden="1" w:unhideWhenUsed="1"/>
+    <w:lsdException w:name="envelope address" w:semiHidden="1" w:unhideWhenUsed="1"/>
+    <w:lsdException w:name="envelope return" w:semiHidden="1" w:unhideWhenUsed="1"/>
+    <w:lsdException w:name="footnote reference" w:semiHidden="1" w:unhideWhenUsed="1"/>
+    <w:lsdException w:name="annotation reference" w:semiHidden="1" w:unhideWhenUsed="1"/>
+    <w:lsdException w:name="line number" w:semiHidden="1" w:unhideWhenUsed="1"/>
+    <w:lsdException w:name="page number" w:semiHidden="1" w:unhideWhenUsed="1"/>
+    <w:lsdException w:name="endnote reference" w:semiHidden="1" w:unhideWhenUsed="1"/>
+    <w:lsdException w:name="endnote text" w:semiHidden="1" w:unhideWhenUsed="1"/>
+    <w:lsdException w:name="table of authorities" w:semiHidden="1" w:unhideWhenUsed="1"/>
+    <w:lsdException w:name="macro" w:semiHidden="1" w:unhideWhenUsed="1"/>
+    <w:lsdException w:name="toa heading" w:semiHidden="1" w:unhideWhenUsed="1"/>
+    <w:lsdException w:name="List" w:semiHidden="1" w:unhideWhenUsed="1"/>
+    <w:lsdException w:name="List Bullet" w:semiHidden="1" w:unhideWhenUsed="1"/>
+    <w:lsdException w:name="List Number" w:semiHidden="1" w:unhideWhenUsed="1"/>
+    <w:lsdException w:name="List 2" w:semiHidden="1" w:unhideWhenUsed="1"/>
+    <w:lsdException w:name="List 3" w:semiHidden="1" w:unhideWhenUsed="1"/>
+    <w:lsdException w:name="List 4" w:semiHidden="1" w:unhideWhenUsed="1"/>
+    <w:lsdException w:name="List 5" w:semiHidden="1" w:unhideWhenUsed="1"/>
+    <w:lsdException w:name="List Bullet 2" w:semiHidden="1" w:unhideWhenUsed="1"/>
+    <w:lsdException w:name="List Bullet 3" w:semiHidden="1" w:unhideWhenUsed="1"/>
+    <w:lsdException w:name="List Bullet 4" w:semiHidden="1" w:unhideWhenUsed="1"/>
+    <w:lsdException w:name="List Bullet 5" w:semiHidden="1" w:unhideWhenUsed="1"/>
+    <w:lsdException w:name="List Number 2" w:semiHidden="1" w:unhideWhenUsed="1"/>
+    <w:lsdException w:name="List Number 3" w:semiHidden="1" w:unhideWhenUsed="1"/>
+    <w:lsdException w:name="List Number 4" w:semiHidden="1" w:unhideWhenUsed="1"/>
+    <w:lsdException w:name="List Number 5" w:semiHidden="1" w:unhideWhenUsed="1"/>
+    <w:lsdException w:name="Title" w:uiPriority="10" w:qFormat="1"/>
+    <w:lsdException w:name="Closing" w:semiHidden="1" w:unhideWhenUsed="1"/>
+    <w:lsdException w:name="Signature" w:semiHidden="1" w:unhideWhenUsed="1"/>
+    <w:lsdException w:name="Default Paragraph Font" w:semiHidden="1" w:uiPriority="1" w:unhideWhenUsed="1"/>
+    <w:lsdException w:name="Body Text" w:semiHidden="1" w:unhideWhenUsed="1"/>
+    <w:lsdException w:name="Body Text Indent" w:semiHidden="1" w:unhideWhenUsed="1"/>
+    <w:lsdException w:name="List Continue" w:semiHidden="1" w:unhideWhenUsed="1"/>
+    <w:lsdException w:name="List Continue 2" w:semiHidden="1" w:unhideWhenUsed="1"/>
+    <w:lsdException w:name="List Continue 3" w:semiHidden="1" w:unhideWhenUsed="1"/>
+    <w:lsdException w:name="List Continue 4" w:semiHidden="1" w:unhideWhenUsed="1"/>
+    <w:lsdException w:name="List Continue 5" w:semiHidden="1" w:unhideWhenUsed="1"/>
+    <w:lsdException w:name="Message Header" w:semiHidden="1" w:unhideWhenUsed="1"/>
+    <w:lsdException w:name="Subtitle" w:uiPriority="11" w:qFormat="1"/>
+    <w:lsdException w:name="Salutation" w:semiHidden="1" w:unhideWhenUsed="1"/>
+    <w:lsdException w:name="Date" w:semiHidden="1" w:unhideWhenUsed="1"/>
+    <w:lsdException w:name="Body Text First Indent" w:semiHidden="1" w:unhideWhenUsed="1"/>
+    <w:lsdException w:name="Body Text First Indent 2" w:semiHidden="1" w:unhideWhenUsed="1"/>
+    <w:lsdException w:name="Note Heading" w:semiHidden="1" w:unhideWhenUsed="1"/>
+    <w:lsdException w:name="Body Text 2" w:semiHidden="1" w:unhideWhenUsed="1"/>
+    <w:lsdException w:name="Body Text 3" w:semiHidden="1" w:unhideWhenUsed="1"/>
+    <w:lsdException w:name="Body Text Indent 2" w:semiHidden="1" w:unhideWhenUsed="1"/>
+    <w:lsdException w:name="Body Text Indent 3" w:semiHidden="1" w:unhideWhenUsed="1"/>
+    <w:lsdException w:name="Block Text" w:semiHidden="1" w:unhideWhenUsed="1"/>
+    <w:lsdException w:name="Hyperlink" w:semiHidden="1" w:unhideWhenUsed="1"/>
+    <w:lsdException w:name="FollowedHyperlink" w:semiHidden="1" w:unhideWhenUsed="1"/>
+    <w:lsdException w:name="Strong" w:uiPriority="22" w:qFormat="1"/>
+    <w:lsdException w:name="Emphasis" w:uiPriority="20" w:qFormat="1"/>
+    <w:lsdException w:name="Document Map" w:semiHidden="1" w:unhideWhenUsed="1"/>
+    <w:lsdException w:name="Plain Text" w:semiHidden="1" w:unhideWhenUsed="1"/>
+    <w:lsdException w:name="E-mail Signature" w:semiHidden="1" w:unhideWhenUsed="1"/>
+    <w:lsdException w:name="HTML Top of Form" w:semiHidden="1" w:unhideWhenUsed="1"/>
+    <w:lsdException w:name="HTML Bottom of Form" w:semiHidden="1" w:unhideWhenUsed="1"/>
+    <w:lsdException w:name="Normal (Web)" w:semiHidden="1" w:unhideWhenUsed="1"/>
+    <w:lsdException w:name="HTML Acronym" w:semiHidden="1" w:unhideWhenUsed="1"/>
+    <w:lsdException w:name="HTML Address" w:semiHidden="1" w:unhideWhenUsed="1"/>
+    <w:lsdException w:name="HTML Cite" w:semiHidden="1" w:unhideWhenUsed="1"/>
+    <w:lsdException w:name="HTML Code" w:semiHidden="1" w:unhideWhenUsed="1"/>
+    <w:lsdException w:name="HTML Definition" w:semiHidden="1" w:unhideWhenUsed="1"/>
+    <w:lsdException w:name="HTML Keyboard" w:semiHidden="1" w:unhideWhenUsed="1"/>
+    <w:lsdException w:name="HTML Preformatted" w:semiHidden="1" w:unhideWhenUsed="1"/>
+    <w:lsdException w:name="HTML Sample" w:semiHidden="1" w:unhideWhenUsed="1"/>
+    <w:lsdException w:name="HTML Typewriter" w:semiHidden="1" w:unhideWhenUsed="1"/>
+    <w:lsdException w:name="HTML Variable" w:semiHidden="1" w:unhideWhenUsed="1"/>
+    <w:lsdException w:name="Normal Table" w:semiHidden="1" w:unhideWhenUsed="1"/>
+    <w:lsdException w:name="annotation subject" w:semiHidden="1" w:unhideWhenUsed="1"/>
+    <w:lsdException w:name="No List" w:semiHidden="1" w:unhideWhenUsed="1"/>
+    <w:lsdException w:name="Outline List 1" w:semiHidden="1" w:unhideWhenUsed="1"/>
+    <w:lsdException w:name="Outline List 2" w:semiHidden="1" w:unhideWhenUsed="1"/>
+    <w:lsdException w:name="Outline List 3" w:semiHidden="1" w:unhideWhenUsed="1"/>
+    <w:lsdException w:name="Table Simple 1" w:semiHidden="1" w:unhideWhenUsed="1"/>
+    <w:lsdException w:name="Table Simple 2" w:semiHidden="1" w:unhideWhenUsed="1"/>
+    <w:lsdException w:name="Table Simple 3" w:semiHidden="1" w:unhideWhenUsed="1"/>
+    <w:lsdException w:name="Table Classic 1" w:semiHidden="1" w:unhideWhenUsed="1"/>
+    <w:lsdException w:name="Table Classic 2" w:semiHidden="1" w:unhideWhenUsed="1"/>
+    <w:lsdException w:name="Table Classic 3" w:semiHidden="1" w:unhideWhenUsed="1"/>
+    <w:lsdException w:name="Table Classic 4" w:semiHidden="1" w:unhideWhenUsed="1"/>
+    <w:lsdException w:name="Table Colorful 1" w:semiHidden="1" w:unhideWhenUsed="1"/>
+    <w:lsdException w:name="Table Colorful 2" w:semiHidden="1" w:unhideWhenUsed="1"/>
+    <w:lsdException w:name="Table Colorful 3" w:semiHidden="1" w:unhideWhenUsed="1"/>
+    <w:lsdException w:name="Table Columns 1" w:semiHidden="1" w:unhideWhenUsed="1"/>
+    <w:lsdException w:name="Table Columns 2" w:semiHidden="1" w:unhideWhenUsed="1"/>
+    <w:lsdException w:name="Table Columns 3" w:semiHidden="1" w:unhideWhenUsed="1"/>
+    <w:lsdException w:name="Table Columns 4" w:semiHidden="1" w:unhideWhenUsed="1"/>
+    <w:lsdException w:name="Table Columns 5" w:semiHidden="1" w:unhideWhenUsed="1"/>
+    <w:lsdException w:name="Table Grid 1" w:semiHidden="1" w:unhideWhenUsed="1"/>
+    <w:lsdException w:name="Table Grid 2" w:semiHidden="1" w:unhideWhenUsed="1"/>
+    <w:lsdException w:name="Table Grid 3" w:semiHidden="1" w:unhideWhenUsed="1"/>
+    <w:lsdException w:name="Table Grid 4" w:semiHidden="1" w:unhideWhenUsed="1"/>
+    <w:lsdException w:name="Table Grid 5" w:semiHidden="1" w:unhideWhenUsed="1"/>
+    <w:lsdException w:name="Table Grid 6" w:semiHidden="1" w:unhideWhenUsed="1"/>
+    <w:lsdException w:name="Table Grid 7" w:semiHidden="1" w:unhideWhenUsed="1"/>
+    <w:lsdException w:name="Table Grid 8" w:semiHidden="1" w:unhideWhenUsed="1"/>
+    <w:lsdException w:name="Table List 1" w:semiHidden="1" w:unhideWhenUsed="1"/>
+    <w:lsdException w:name="Table List 2" w:semiHidden="1" w:unhideWhenUsed="1"/>
+    <w:lsdException w:name="Table List 3" w:semiHidden="1" w:unhideWhenUsed="1"/>
+    <w:lsdException w:name="Table List 4" w:semiHidden="1" w:unhideWhenUsed="1"/>
+    <w:lsdException w:name="Table List 5" w:semiHidden="1" w:unhideWhenUsed="1"/>
+    <w:lsdException w:name="Table List 6" w:semiHidden="1" w:unhideWhenUsed="1"/>
+    <w:lsdException w:name="Table List 7" w:semiHidden="1" w:unhideWhenUsed="1"/>
+    <w:lsdException w:name="Table List 8" w:semiHidden="1" w:unhideWhenUsed="1"/>
+    <w:lsdException w:name="Table 3D effects 1" w:semiHidden="1" w:unhideWhenUsed="1"/>
+    <w:lsdException w:name="Table 3D effects 2" w:semiHidden="1" w:unhideWhenUsed="1"/>
+    <w:lsdException w:name="Table 3D effects 3" w:semiHidden="1" w:unhideWhenUsed="1"/>
+    <w:lsdException w:name="Table Contemporary" w:semiHidden="1" w:unhideWhenUsed="1"/>
+    <w:lsdException w:name="Table Elegant" w:semiHidden="1" w:unhideWhenUsed="1"/>
+    <w:lsdException w:name="Table Professional" w:semiHidden="1" w:unhideWhenUsed="1"/>
+    <w:lsdException w:name="Table Subtle 1" w:semiHidden="1" w:unhideWhenUsed="1"/>
+    <w:lsdException w:name="Table Subtle 2" w:semiHidden="1" w:unhideWhenUsed="1"/>
+    <w:lsdException w:name="Table Web 1" w:semiHidden="1" w:unhideWhenUsed="1"/>
+    <w:lsdException w:name="Table Web 2" w:semiHidden="1" w:unhideWhenUsed="1"/>
+    <w:lsdException w:name="Table Web 3" w:semiHidden="1" w:unhideWhenUsed="1"/>
+    <w:lsdException w:name="Balloon Text" w:semiHidden="1" w:unhideWhenUsed="1"/>
+    <w:lsdException w:name="Table Grid" w:uiPriority="39"/>
+    <w:lsdException w:name="Table Theme" w:semiHidden="1" w:unhideWhenUsed="1"/>
+    <w:lsdException w:name="Placeholder Text" w:semiHidden="1"/>
+    <w:lsdException w:name="No Spacing" w:uiPriority="1" w:qFormat="1"/>
+    <w:lsdException w:name="Light Shading" w:uiPriority="60"/>
+    <w:lsdException w:name="Light List" w:uiPriority="61"/>
+    <w:lsdException w:name="Light Grid" w:uiPriority="62"/>
+    <w:lsdException w:name="Medium Shading 1" w:uiPriority="63"/>
+    <w:lsdException w:name="Medium Shading 2" w:uiPriority="64"/>
+    <w:lsdException w:name="Medium List 1" w:uiPriority="65"/>
+    <w:lsdException w:name="Medium List 2" w:uiPriority="66"/>
+    <w:lsdException w:name="Medium Grid 1" w:uiPriority="67"/>
+    <w:lsdException w:name="Medium Grid 2" w:uiPriority="68"/>
+    <w:lsdException w:name="Medium Grid 3" w:uiPriority="69"/>
+    <w:lsdException w:name="Dark List" w:uiPriority="70"/>
+    <w:lsdException w:name="Colorful Shading" w:uiPriority="71"/>
+    <w:lsdException w:name="Colorful List" w:uiPriority="72"/>
+    <w:lsdException w:name="Colorful Grid" w:uiPriority="73"/>
+    <w:lsdException w:name="Light Shading Accent 1" w:uiPriority="60"/>
+    <w:lsdException w:name="Light List Accent 1" w:uiPriority="61"/>
+    <w:lsdException w:name="Light Grid Accent 1" w:uiPriority="62"/>
+    <w:lsdException w:name="Medium Shading 1 Accent 1" w:uiPriority="63"/>
+    <w:lsdException w:name="Medium Shading 2 Accent 1" w:uiPriority="64"/>
+    <w:lsdException w:name="Medium List 1 Accent 1" w:uiPriority="65"/>
+    <w:lsdException w:name="Revision" w:semiHidden="1"/>
+    <w:lsdException w:name="List Paragraph" w:uiPriority="34" w:qFormat="1"/>
+    <w:lsdException w:name="Quote" w:uiPriority="29" w:qFormat="1"/>
+    <w:lsdException w:name="Intense Quote" w:uiPriority="30" w:qFormat="1"/>
+    <w:lsdException w:name="Medium List 2 Accent 1" w:uiPriority="66"/>
+    <w:lsdException w:name="Medium Grid 1 Accent 1" w:uiPriority="67"/>
+    <w:lsdException w:name="Medium Grid 2 Accent 1" w:uiPriority="68"/>
+    <w:lsdException w:name="Medium Grid 3 Accent 1" w:uiPriority="69"/>
+    <w:lsdException w:name="Dark List Accent 1" w:uiPriority="70"/>
+    <w:lsdException w:name="Colorful Shading Accent 1" w:uiPriority="71"/>
+    <w:lsdException w:name="Colorful List Accent 1" w:uiPriority="72"/>
+    <w:lsdException w:name="Colorful Grid Accent 1" w:uiPriority="73"/>
+    <w:lsdException w:name="Light Shading Accent 2" w:uiPriority="60"/>
+    <w:lsdException w:name="Light List Accent 2" w:uiPriority="61"/>
+    <w:lsdException w:name="Light Grid Accent 2" w:uiPriority="62"/>
+    <w:lsdException w:name="Medium Shading 1 Accent 2" w:uiPriority="63"/>
+    <w:lsdException w:name="Medium Shading 2 Accent 2" w:uiPriority="64"/>
+    <w:lsdException w:name="Medium List 1 Accent 2" w:uiPriority="65"/>
+    <w:lsdException w:name="Medium List 2 Accent 2" w:uiPriority="66"/>
+    <w:lsdException w:name="Medium Grid 1 Accent 2" w:uiPriority="67"/>
+    <w:lsdException w:name="Medium Grid 2 Accent 2" w:uiPriority="68"/>
+    <w:lsdException w:name="Medium Grid 3 Accent 2" w:uiPriority="69"/>
+    <w:lsdException w:name="Dark List Accent 2" w:uiPriority="70"/>
+    <w:lsdException w:name="Colorful Shading Accent 2" w:uiPriority="71"/>
+    <w:lsdException w:name="Colorful List Accent 2" w:uiPriority="72"/>
+    <w:lsdException w:name="Colorful Grid Accent 2" w:uiPriority="73"/>
+    <w:lsdException w:name="Light Shading Accent 3" w:uiPriority="60"/>
+    <w:lsdException w:name="Light List Accent 3" w:uiPriority="61"/>
+    <w:lsdException w:name="Light Grid Accent 3" w:uiPriority="62"/>
+    <w:lsdException w:name="Medium Shading 1 Accent 3" w:uiPriority="63"/>
+    <w:lsdException w:name="Medium Shading 2 Accent 3" w:uiPriority="64"/>
+    <w:lsdException w:name="Medium List 1 Accent 3" w:uiPriority="65"/>
+    <w:lsdException w:name="Medium List 2 Accent 3" w:uiPriority="66"/>
+    <w:lsdException w:name="Medium Grid 1 Accent 3" w:uiPriority="67"/>
+    <w:lsdException w:name="Medium Grid 2 Accent 3" w:uiPriority="68"/>
+    <w:lsdException w:name="Medium Grid 3 Accent 3" w:uiPriority="69"/>
+    <w:lsdException w:name="Dark List Accent 3" w:uiPriority="70"/>
+    <w:lsdException w:name="Colorful Shading Accent 3" w:uiPriority="71"/>
+    <w:lsdException w:name="Colorful List Accent 3" w:uiPriority="72"/>
+    <w:lsdException w:name="Colorful Grid Accent 3" w:uiPriority="73"/>
+    <w:lsdException w:name="Light Shading Accent 4" w:uiPriority="60"/>
+    <w:lsdException w:name="Light List Accent 4" w:uiPriority="61"/>
+    <w:lsdException w:name="Light Grid Accent 4" w:uiPriority="62"/>
+    <w:lsdException w:name="Medium Shading 1 Accent 4" w:uiPriority="63"/>
+    <w:lsdException w:name="Medium Shading 2 Accent 4" w:uiPriority="64"/>
+    <w:lsdException w:name="Medium List 1 Accent 4" w:uiPriority="65"/>
+    <w:lsdException w:name="Medium List 2 Accent 4" w:uiPriority="66"/>
+    <w:lsdException w:name="Medium Grid 1 Accent 4" w:uiPriority="67"/>
+    <w:lsdException w:name="Medium Grid 2 Accent 4" w:uiPriority="68"/>
+    <w:lsdException w:name="Medium Grid 3 Accent 4" w:uiPriority="69"/>
+    <w:lsdException w:name="Dark List Accent 4" w:uiPriority="70"/>
+    <w:lsdException w:name="Colorful Shading Accent 4" w:uiPriority="71"/>
+    <w:lsdException w:name="Colorful List Accent 4" w:uiPriority="72"/>
+    <w:lsdException w:name="Colorful Grid Accent 4" w:uiPriority="73"/>
+    <w:lsdException w:name="Light Shading Accent 5" w:uiPriority="60"/>
+    <w:lsdException w:name="Light List Accent 5" w:uiPriority="61"/>
+    <w:lsdException w:name="Light Grid Accent 5" w:uiPriority="62"/>
+    <w:lsdException w:name="Medium Shading 1 Accent 5" w:uiPriority="63"/>
+    <w:lsdException w:name="Medium Shading 2 Accent 5" w:uiPriority="64"/>
+    <w:lsdException w:name="Medium List 1 Accent 5" w:uiPriority="65"/>
+    <w:lsdException w:name="Medium List 2 Accent 5" w:uiPriority="66"/>
+    <w:lsdException w:name="Medium Grid 1 Accent 5" w:uiPriority="67"/>
+    <w:lsdException w:name="Medium Grid 2 Accent 5" w:uiPriority="68"/>
+    <w:lsdException w:name="Medium Grid 3 Accent 5" w:uiPriority="69"/>
+    <w:lsdException w:name="Dark List Accent 5" w:uiPriority="70"/>
+    <w:lsdException w:name="Colorful Shading Accent 5" w:uiPriority="71"/>
+    <w:lsdException w:name="Colorful List Accent 5" w:uiPriority="72"/>
+    <w:lsdException w:name="Colorful Grid Accent 5" w:uiPriority="73"/>
+    <w:lsdException w:name="Light Shading Accent 6" w:uiPriority="60"/>
+    <w:lsdException w:name="Light List Accent 6" w:uiPriority="61"/>
+    <w:lsdException w:name="Light Grid Accent 6" w:uiPriority="62"/>
+    <w:lsdException w:name="Medium Shading 1 Accent 6" w:uiPriority="63"/>
+    <w:lsdException w:name="Medium Shading 2 Accent 6" w:uiPriority="64"/>
+    <w:lsdException w:name="Medium List 1 Accent 6" w:uiPriority="65"/>
+    <w:lsdException w:name="Medium List 2 Accent 6" w:uiPriority="66"/>
+    <w:lsdException w:name="Medium Grid 1 Accent 6" w:uiPriority="67"/>
+    <w:lsdException w:name="Medium Grid 2 Accent 6" w:uiPriority="68"/>
+    <w:lsdException w:name="Medium Grid 3 Accent 6" w:uiPriority="69"/>
+    <w:lsdException w:name="Dark List Accent 6" w:uiPriority="70"/>
+    <w:lsdException w:name="Colorful Shading Accent 6" w:uiPriority="71"/>
+    <w:lsdException w:name="Colorful List Accent 6" w:uiPriority="72"/>
+    <w:lsdException w:name="Colorful Grid Accent 6" w:uiPriority="73"/>
+    <w:lsdException w:name="Subtle Emphasis" w:uiPriority="19" w:qFormat="1"/>
+    <w:lsdException w:name="Intense Emphasis" w:uiPriority="21" w:qFormat="1"/>
+    <w:lsdException w:name="Subtle Reference" w:uiPriority="31" w:qFormat="1"/>
+    <w:lsdException w:name="Intense Reference" w:uiPriority="32" w:qFormat="1"/>
+    <w:lsdException w:name="Book Title" w:uiPriority="33" w:qFormat="1"/>
+    <w:lsdException w:name="Bibliography" w:semiHidden="1" w:uiPriority="37" w:unhideWhenUsed="1"/>
+    <w:lsdException w:name="TOC Heading" w:semiHidden="1" w:uiPriority="39" w:unhideWhenUsed="1" w:qFormat="1"/>
+    <w:lsdException w:name="Plain Table 1" w:uiPriority="41"/>
+    <w:lsdException w:name="Plain Table 2" w:uiPriority="42"/>
+    <w:lsdException w:name="Plain Table 3" w:uiPriority="43"/>
+    <w:lsdException w:name="Plain Table 4" w:uiPriority="44"/>
+    <w:lsdException w:name="Plain Table 5" w:uiPriority="45"/>
+    <w:lsdException w:name="Grid Table Light" w:uiPriority="40"/>
+    <w:lsdException w:name="Grid Table 1 Light" w:uiPriority="46"/>
+    <w:lsdException w:name="Grid Table 2" w:uiPriority="47"/>
+    <w:lsdException w:name="Grid Table 3" w:uiPriority="48"/>
+    <w:lsdException w:name="Grid Table 4" w:uiPriority="49"/>
+    <w:lsdException w:name="Grid Table 5 Dark" w:uiPriority="50"/>
+    <w:lsdException w:name="Grid Table 6 Colorful" w:uiPriority="51"/>
+    <w:lsdException w:name="Grid Table 7 Colorful" w:uiPriority="52"/>
+    <w:lsdException w:name="Grid Table 1 Light Accent 1" w:uiPriority="46"/>
+    <w:lsdException w:name="Grid Table 2 Accent 1" w:uiPriority="47"/>
+    <w:lsdException w:name="Grid Table 3 Accent 1" w:uiPriority="48"/>
+    <w:lsdException w:name="Grid Table 4 Accent 1" w:uiPriority="49"/>
+    <w:lsdException w:name="Grid Table 5 Dark Accent 1" w:uiPriority="50"/>
+    <w:lsdException w:name="Grid Table 6 Colorful Accent 1" w:uiPriority="51"/>
+    <w:lsdException w:name="Grid Table 7 Colorful Accent 1" w:uiPriority="52"/>
+    <w:lsdException w:name="Grid Table 1 Light Accent 2" w:uiPriority="46"/>
+    <w:lsdException w:name="Grid Table 2 Accent 2" w:uiPriority="47"/>
+    <w:lsdException w:name="Grid Table 3 Accent 2" w:uiPriority="48"/>
+    <w:lsdException w:name="Grid Table 4 Accent 2" w:uiPriority="49"/>
+    <w:lsdException w:name="Grid Table 5 Dark Accent 2" w:uiPriority="50"/>
+    <w:lsdException w:name="Grid Table 6 Colorful Accent 2" w:uiPriority="51"/>
+    <w:lsdException w:name="Grid Table 7 Colorful Accent 2" w:uiPriority="52"/>
+    <w:lsdException w:name="Grid Table 1 Light Accent 3" w:uiPriority="46"/>
+    <w:lsdException w:name="Grid Table 2 Accent 3" w:uiPriority="47"/>
+    <w:lsdException w:name="Grid Table 3 Accent 3" w:uiPriority="48"/>
+    <w:lsdException w:name="Grid Table 4 Accent 3" w:uiPriority="49"/>
+    <w:lsdException w:name="Grid Table 5 Dark Accent 3" w:uiPriority="50"/>
+    <w:lsdException w:name="Grid Table 6 Colorful Accent 3" w:uiPriority="51"/>
+    <w:lsdException w:name="Grid Table 7 Colorful Accent 3" w:uiPriority="52"/>
+    <w:lsdException w:name="Grid Table 1 Light Accent 4" w:uiPriority="46"/>
+    <w:lsdException w:name="Grid Table 2 Accent 4" w:uiPriority="47"/>
+    <w:lsdException w:name="Grid Table 3 Accent 4" w:uiPriority="48"/>
+    <w:lsdException w:name="Grid Table 4 Accent 4" w:uiPriority="49"/>
+    <w:lsdException w:name="Grid Table 5 Dark Accent 4" w:uiPriority="50"/>
+    <w:lsdException w:name="Grid Table 6 Colorful Accent 4" w:uiPriority="51"/>
+    <w:lsdException w:name="Grid Table 7 Colorful Accent 4" w:uiPriority="52"/>
+    <w:lsdException w:name="Grid Table 1 Light Accent 5" w:uiPriority="46"/>
+    <w:lsdException w:name="Grid Table 2 Accent 5" w:uiPriority="47"/>
+    <w:lsdException w:name="Grid Table 3 Accent 5" w:uiPriority="48"/>
+    <w:lsdException w:name="Grid Table 4 Accent 5" w:uiPriority="49"/>
+    <w:lsdException w:name="Grid Table 5 Dark Accent 5" w:uiPriority="50"/>
+    <w:lsdException w:name="Grid Table 6 Colorful Accent 5" w:uiPriority="51"/>
+    <w:lsdException w:name="Grid Table 7 Colorful Accent 5" w:uiPriority="52"/>
+    <w:lsdException w:name="Grid Table 1 Light Accent 6" w:uiPriority="46"/>
+    <w:lsdException w:name="Grid Table 2 Accent 6" w:uiPriority="47"/>
+    <w:lsdException w:name="Grid Table 3 Accent 6" w:uiPriority="48"/>
+    <w:lsdException w:name="Grid Table 4 Accent 6" w:uiPriority="49"/>
+    <w:lsdException w:name="Grid Table 5 Dark Accent 6" w:uiPriority="50"/>
+    <w:lsdException w:name="Grid Table 6 Colorful Accent 6" w:uiPriority="51"/>
+    <w:lsdException w:name="Grid Table 7 Colorful Accent 6" w:uiPriority="52"/>
+    <w:lsdException w:name="List Table 1 Light" w:uiPriority="46"/>
+    <w:lsdException w:name="List Table 2" w:uiPriority="47"/>
+    <w:lsdException w:name="List Table 3" w:uiPriority="48"/>
+    <w:lsdException w:name="List Table 4" w:uiPriority="49"/>
+    <w:lsdException w:name="List Table 5 Dark" w:uiPriority="50"/>
+    <w:lsdException w:name="List Table 6 Colorful" w:uiPriority="51"/>
+    <w:lsdException w:name="List Table 7 Colorful" w:uiPriority="52"/>
+    <w:lsdException w:name="List Table 1 Light Accent 1" w:uiPriority="46"/>
+    <w:lsdException w:name="List Table 2 Accent 1" w:uiPriority="47"/>
+    <w:lsdException w:name="List Table 3 Accent 1" w:uiPriority="48"/>
+    <w:lsdException w:name="List Table 4 Accent 1" w:uiPriority="49"/>
+    <w:lsdException w:name="List Table 5 Dark Accent 1" w:uiPriority="50"/>
+    <w:lsdException w:name="List Table 6 Colorful Accent 1" w:uiPriority="51"/>
+    <w:lsdException w:name="List Table 7 Colorful Accent 1" w:uiPriority="52"/>
+    <w:lsdException w:name="List Table 1 Light Accent 2" w:uiPriority="46"/>
+    <w:lsdException w:name="List Table 2 Accent 2" w:uiPriority="47"/>
+    <w:lsdException w:name="List Table 3 Accent 2" w:uiPriority="48"/>
+    <w:lsdException w:name="List Table 4 Accent 2" w:uiPriority="49"/>
+    <w:lsdException w:name="List Table 5 Dark Accent 2" w:uiPriority="50"/>
+    <w:lsdException w:name="List Table 6 Colorful Accent 2" w:uiPriority="51"/>
+    <w:lsdException w:name="List Table 7 Colorful Accent 2" w:uiPriority="52"/>
+    <w:lsdException w:name="List Table 1 Light Accent 3" w:uiPriority="46"/>
+    <w:lsdException w:name="List Table 2 Accent 3" w:uiPriority="47"/>
+    <w:lsdException w:name="List Table 3 Accent 3" w:uiPriority="48"/>
+    <w:lsdException w:name="List Table 4 Accent 3" w:uiPriority="49"/>
+    <w:lsdException w:name="List Table 5 Dark Accent 3" w:uiPriority="50"/>
+    <w:lsdException w:name="List Table 6 Colorful Accent 3" w:uiPriority="51"/>
+    <w:lsdException w:name="List Table 7 Colorful Accent 3" w:uiPriority="52"/>
+    <w:lsdException w:name="List Table 1 Light Accent 4" w:uiPriority="46"/>
+    <w:lsdException w:name="List Table 2 Accent 4" w:uiPriority="47"/>
+    <w:lsdException w:name="List Table 3 Accent 4" w:uiPriority="48"/>
+    <w:lsdException w:name="List Table 4 Accent 4" w:uiPriority="49"/>
+    <w:lsdException w:name="List Table 5 Dark Accent 4" w:uiPriority="50"/>
+    <w:lsdException w:name="List Table 6 Colorful Accent 4" w:uiPriority="51"/>
+    <w:lsdException w:name="List Table 7 Colorful Accent 4" w:uiPriority="52"/>
+    <w:lsdException w:name="List Table 1 Light Accent 5" w:uiPriority="46"/>
+    <w:lsdException w:name="List Table 2 Accent 5" w:uiPriority="47"/>
+    <w:lsdException w:name="List Table 3 Accent 5" w:uiPriority="48"/>
+    <w:lsdException w:name="List Table 4 Accent 5" w:uiPriority="49"/>
+    <w:lsdException w:name="List Table 5 Dark Accent 5" w:uiPriority="50"/>
+    <w:lsdException w:name="List Table 6 Colorful Accent 5" w:uiPriority="51"/>
+    <w:lsdException w:name="List Table 7 Colorful Accent 5" w:uiPriority="52"/>
+    <w:lsdException w:name="List Table 1 Light Accent 6" w:uiPriority="46"/>
+    <w:lsdException w:name="List Table 2 Accent 6" w:uiPriority="47"/>
+    <w:lsdException w:name="List Table 3 Accent 6" w:uiPriority="48"/>
+    <w:lsdException w:name="List Table 4 Accent 6" w:uiPriority="49"/>
+    <w:lsdException w:name="List Table 5 Dark Accent 6" w:uiPriority="50"/>
+    <w:lsdException w:name="List Table 6 Colorful Accent 6" w:uiPriority="51"/>
+    <w:lsdException w:name="List Table 7 Colorful Accent 6" w:uiPriority="52"/>
+    <w:lsdException w:name="Mention" w:semiHidden="1" w:unhideWhenUsed="1"/>
+    <w:lsdException w:name="Smart Hyperlink" w:semiHidden="1" w:unhideWhenUsed="1"/>
+    <w:lsdException w:name="Hashtag" w:semiHidden="1" w:unhideWhenUsed="1"/>
+    <w:lsdException w:name="Unresolved Mention" w:semiHidden="1" w:unhideWhenUsed="1"/>
+    <w:lsdException w:name="Smart Link" w:semiHidden="1" w:unhideWhenUsed="1"/>
+  </w:latentStyles>
+  <w:style w:type="paragraph" w:default="1" w:styleId="Standard">
     <w:name w:val="Normal"/>
-    <w:next w:val="style0"/>
     <w:qFormat/>
     <w:pPr>
-      <w:spacing w:after="200" w:lineRule="auto" w:line="276"/>
+      <w:spacing w:after="200" w:line="276" w:lineRule="auto"/>
     </w:pPr>
     <w:rPr>
       <w:sz w:val="22"/>
       <w:szCs w:val="22"/>
+      <w:lang w:val="en-US" w:eastAsia="zh-CN"/>
     </w:rPr>
   </w:style>
-  <w:style w:type="character" w:default="1" w:styleId="style65">
+  <w:style w:type="character" w:default="1" w:styleId="Absatz-Standardschriftart">
     <w:name w:val="Default Paragraph Font"/>
-    <w:next w:val="style65"/>
-    <w:rPr>
-      <w:rFonts w:ascii="Calibri" w:cs="Times New Roman" w:eastAsia="宋体" w:hAnsi="Calibri"/>
-    </w:rPr>
+    <w:uiPriority w:val="1"/>
+    <w:semiHidden/>
+    <w:unhideWhenUsed/>
   </w:style>
-  <w:style w:type="table" w:default="1" w:styleId="style105">
+  <w:style w:type="table" w:default="1" w:styleId="NormaleTabelle">
     <w:name w:val="Normal Table"/>
-    <w:next w:val="style105"/>
-    <w:pPr/>
-    <w:rPr/>
+    <w:uiPriority w:val="99"/>
+    <w:semiHidden/>
+    <w:unhideWhenUsed/>
     <w:tblPr>
       <w:tblInd w:w="0" w:type="dxa"/>
       <w:tblCellMar>
@@ -1878,26 +2236,46 @@
         <w:right w:w="108" w:type="dxa"/>
       </w:tblCellMar>
     </w:tblPr>
-    <w:tcPr>
-      <w:tcBorders/>
-    </w:tcPr>
   </w:style>
-  <w:style w:type="numbering" w:default="1" w:styleId="style107">
+  <w:style w:type="numbering" w:default="1" w:styleId="KeineListe">
     <w:name w:val="No List"/>
-    <w:next w:val="style107"/>
-    <w:pPr/>
+    <w:uiPriority w:val="99"/>
+    <w:semiHidden/>
+    <w:unhideWhenUsed/>
   </w:style>
-  <w:style w:type="paragraph" w:styleId="style179">
+  <w:style w:type="paragraph" w:styleId="Listenabsatz">
     <w:name w:val="List Paragraph"/>
-    <w:basedOn w:val="style0"/>
-    <w:next w:val="style179"/>
+    <w:basedOn w:val="Standard"/>
+    <w:uiPriority w:val="34"/>
     <w:qFormat/>
-    <w:uiPriority w:val="34"/>
     <w:pPr>
       <w:ind w:left="720"/>
       <w:contextualSpacing/>
     </w:pPr>
-    <w:rPr/>
+  </w:style>
+  <w:style w:type="paragraph" w:styleId="Kopfzeile">
+    <w:name w:val="header"/>
+    <w:basedOn w:val="Standard"/>
+    <w:link w:val="KopfzeileZchn"/>
+    <w:uiPriority w:val="99"/>
+    <w:unhideWhenUsed/>
+    <w:rsid w:val="00F34DF7"/>
+    <w:pPr>
+      <w:tabs>
+        <w:tab w:val="center" w:pos="4536"/>
+        <w:tab w:val="right" w:pos="9072"/>
+      </w:tabs>
+    </w:pPr>
+  </w:style>
+  <w:style w:type="character" w:customStyle="1" w:styleId="KopfzeileZchn">
+    <w:name w:val="Kopfzeile Zchn"/>
+    <w:link w:val="Kopfzeile"/>
+    <w:uiPriority w:val="99"/>
+    <w:rsid w:val="00F34DF7"/>
+    <w:rPr>
+      <w:sz w:val="22"/>
+      <w:szCs w:val="22"/>
+    </w:rPr>
   </w:style>
 </w:styles>
 </file>
@@ -2185,4 +2563,10 @@
   <a:objectDefaults/>
   <a:extraClrSchemeLst/>
 </a:theme>
+</file>
+
+<file path=docMetadata/LabelInfo.xml><?xml version="1.0" encoding="utf-8"?>
+<clbl:labelList xmlns:clbl="http://schemas.microsoft.com/office/2020/mipLabelMetadata">
+  <clbl:label id="{9d2ceba4-9749-4548-9ddd-a21ec9790cc9}" enabled="1" method="Standard" siteId="{45de56ea-e505-43a5-bd60-4957c8afc438}" contentBits="1" removed="0"/>
+</clbl:labelList>
 </file>
</xml_diff>

<commit_message>
vault backup: 2026-09-30 20:25:33
</commit_message>
<xml_diff>
--- a/Übergabe KJF 1.docx
+++ b/Übergabe KJF 1.docx
@@ -9,26 +9,43 @@
           <w:bCs/>
         </w:rPr>
       </w:pPr>
+      <w:proofErr w:type="spellStart"/>
       <w:r>
         <w:rPr>
           <w:b/>
           <w:bCs/>
           <w:lang w:val="de-DE"/>
         </w:rPr>
-        <w:t xml:space="preserve">Uebergabe </w:t>
-      </w:r>
+        <w:t>Uebergabe</w:t>
+      </w:r>
+      <w:proofErr w:type="spellEnd"/>
       <w:r>
         <w:rPr>
           <w:b/>
           <w:bCs/>
+          <w:lang w:val="de-DE"/>
+        </w:rPr>
+        <w:t xml:space="preserve"> </w:t>
+      </w:r>
+      <w:proofErr w:type="spellStart"/>
+      <w:r>
+        <w:rPr>
+          <w:b/>
+          <w:bCs/>
         </w:rPr>
         <w:t>Kreisjugendleitung</w:t>
       </w:r>
+      <w:proofErr w:type="spellEnd"/>
     </w:p>
     <w:p/>
     <w:p>
-      <w:r>
-        <w:t>Aktuelles:</w:t>
+      <w:proofErr w:type="spellStart"/>
+      <w:r>
+        <w:t>Aktuelles</w:t>
+      </w:r>
+      <w:proofErr w:type="spellEnd"/>
+      <w:r>
+        <w:t>:</w:t>
       </w:r>
     </w:p>
     <w:p/>
@@ -47,7 +64,21 @@
         <w:rPr>
           <w:lang w:val="de-DE"/>
         </w:rPr>
-        <w:t>Ehrungstermin 30.10. Tobias Lohrum beim Ehrungsabend der FF Mudau (Kreisehrung)</w:t>
+        <w:t xml:space="preserve">Ehrungstermin 30.10. Tobias </w:t>
+      </w:r>
+      <w:proofErr w:type="spellStart"/>
+      <w:r>
+        <w:rPr>
+          <w:lang w:val="de-DE"/>
+        </w:rPr>
+        <w:t>Lohrum</w:t>
+      </w:r>
+      <w:proofErr w:type="spellEnd"/>
+      <w:r>
+        <w:rPr>
+          <w:lang w:val="de-DE"/>
+        </w:rPr>
+        <w:t xml:space="preserve"> beim Ehrungsabend der FF Mudau (Kreisehrung)</w:t>
       </w:r>
     </w:p>
     <w:p>
@@ -211,8 +242,29 @@
       </w:pPr>
     </w:p>
     <w:p>
-      <w:r>
-        <w:t xml:space="preserve">Generell zu erledigen: </w:t>
+      <w:proofErr w:type="spellStart"/>
+      <w:r>
+        <w:t>Generell</w:t>
+      </w:r>
+      <w:proofErr w:type="spellEnd"/>
+      <w:r>
+        <w:t xml:space="preserve"> </w:t>
+      </w:r>
+      <w:proofErr w:type="spellStart"/>
+      <w:r>
+        <w:t>zu</w:t>
+      </w:r>
+      <w:proofErr w:type="spellEnd"/>
+      <w:r>
+        <w:t xml:space="preserve"> </w:t>
+      </w:r>
+      <w:proofErr w:type="spellStart"/>
+      <w:r>
+        <w:t>erledigen</w:t>
+      </w:r>
+      <w:proofErr w:type="spellEnd"/>
+      <w:r>
+        <w:t xml:space="preserve">: </w:t>
       </w:r>
     </w:p>
     <w:p/>
@@ -224,8 +276,29 @@
           <w:numId w:val="2"/>
         </w:numPr>
       </w:pPr>
-      <w:r>
-        <w:t xml:space="preserve">Jahresbericht an Verbandsversammlung Kreisfeuerwehrverband </w:t>
+      <w:proofErr w:type="spellStart"/>
+      <w:r>
+        <w:t>Jahresbericht</w:t>
+      </w:r>
+      <w:proofErr w:type="spellEnd"/>
+      <w:r>
+        <w:t xml:space="preserve"> an </w:t>
+      </w:r>
+      <w:proofErr w:type="spellStart"/>
+      <w:r>
+        <w:t>Verbandsversammlung</w:t>
+      </w:r>
+      <w:proofErr w:type="spellEnd"/>
+      <w:r>
+        <w:t xml:space="preserve"> </w:t>
+      </w:r>
+      <w:proofErr w:type="spellStart"/>
+      <w:r>
+        <w:t>Kreisfeuerwehrverband</w:t>
+      </w:r>
+      <w:proofErr w:type="spellEnd"/>
+      <w:r>
+        <w:t xml:space="preserve"> </w:t>
       </w:r>
     </w:p>
     <w:p>
@@ -284,9 +357,19 @@
           <w:numId w:val="2"/>
         </w:numPr>
       </w:pPr>
-      <w:r>
-        <w:t>Teilnahme an Kreisjugendwartseminaren</w:t>
-      </w:r>
+      <w:proofErr w:type="spellStart"/>
+      <w:r>
+        <w:t>Teilnahme</w:t>
+      </w:r>
+      <w:proofErr w:type="spellEnd"/>
+      <w:r>
+        <w:t xml:space="preserve"> an </w:t>
+      </w:r>
+      <w:proofErr w:type="spellStart"/>
+      <w:r>
+        <w:t>Kreisjugendwartseminaren</w:t>
+      </w:r>
+      <w:proofErr w:type="spellEnd"/>
     </w:p>
     <w:p>
       <w:pPr>
@@ -296,8 +379,21 @@
           <w:numId w:val="2"/>
         </w:numPr>
       </w:pPr>
-      <w:r>
-        <w:t>Teilnahme an Verbandsversammlung LFV</w:t>
+      <w:proofErr w:type="spellStart"/>
+      <w:r>
+        <w:t>Teilnahme</w:t>
+      </w:r>
+      <w:proofErr w:type="spellEnd"/>
+      <w:r>
+        <w:t xml:space="preserve"> an </w:t>
+      </w:r>
+      <w:proofErr w:type="spellStart"/>
+      <w:r>
+        <w:t>Verbandsversammlung</w:t>
+      </w:r>
+      <w:proofErr w:type="spellEnd"/>
+      <w:r>
+        <w:t xml:space="preserve"> LFV</w:t>
       </w:r>
     </w:p>
     <w:p>
@@ -327,7 +423,21 @@
         <w:rPr>
           <w:lang w:val="de-DE"/>
         </w:rPr>
-        <w:t>ge (bekommt an ne Mail)</w:t>
+        <w:t xml:space="preserve">ge (bekommt an </w:t>
+      </w:r>
+      <w:proofErr w:type="spellStart"/>
+      <w:r>
+        <w:rPr>
+          <w:lang w:val="de-DE"/>
+        </w:rPr>
+        <w:t>ne</w:t>
+      </w:r>
+      <w:proofErr w:type="spellEnd"/>
+      <w:r>
+        <w:rPr>
+          <w:lang w:val="de-DE"/>
+        </w:rPr>
+        <w:t xml:space="preserve"> Mail)</w:t>
       </w:r>
     </w:p>
     <w:p>
@@ -345,7 +455,21 @@
         <w:rPr>
           <w:lang w:val="de-DE"/>
         </w:rPr>
-        <w:t>Alle 2 Jahre Statistik an Statitisches Landesamt (da kommt ein Schreiben)</w:t>
+        <w:t xml:space="preserve">Alle 2 Jahre Statistik an </w:t>
+      </w:r>
+      <w:proofErr w:type="spellStart"/>
+      <w:r>
+        <w:rPr>
+          <w:lang w:val="de-DE"/>
+        </w:rPr>
+        <w:t>Statitisches</w:t>
+      </w:r>
+      <w:proofErr w:type="spellEnd"/>
+      <w:r>
+        <w:rPr>
+          <w:lang w:val="de-DE"/>
+        </w:rPr>
+        <w:t xml:space="preserve"> Landesamt (da kommt ein Schreiben)</w:t>
       </w:r>
     </w:p>
     <w:p>
@@ -356,8 +480,21 @@
           <w:numId w:val="2"/>
         </w:numPr>
       </w:pPr>
-      <w:r>
-        <w:t>Teilnahme an Sitzungen der Region</w:t>
+      <w:proofErr w:type="spellStart"/>
+      <w:r>
+        <w:t>Teilnahme</w:t>
+      </w:r>
+      <w:proofErr w:type="spellEnd"/>
+      <w:r>
+        <w:t xml:space="preserve"> an </w:t>
+      </w:r>
+      <w:proofErr w:type="spellStart"/>
+      <w:r>
+        <w:t>Sitzungen</w:t>
+      </w:r>
+      <w:proofErr w:type="spellEnd"/>
+      <w:r>
+        <w:t xml:space="preserve"> der Region</w:t>
       </w:r>
     </w:p>
     <w:p>
@@ -368,8 +505,21 @@
           <w:numId w:val="2"/>
         </w:numPr>
       </w:pPr>
-      <w:r>
-        <w:t>Jahresberichte (mit Rainer kl</w:t>
+      <w:proofErr w:type="spellStart"/>
+      <w:r>
+        <w:t>Jahresberichte</w:t>
+      </w:r>
+      <w:proofErr w:type="spellEnd"/>
+      <w:r>
+        <w:t xml:space="preserve"> (</w:t>
+      </w:r>
+      <w:proofErr w:type="spellStart"/>
+      <w:r>
+        <w:t>mit</w:t>
+      </w:r>
+      <w:proofErr w:type="spellEnd"/>
+      <w:r>
+        <w:t xml:space="preserve"> Rainer kl</w:t>
       </w:r>
       <w:r>
         <w:rPr>
@@ -450,7 +600,21 @@
         <w:rPr>
           <w:lang w:val="de-DE"/>
         </w:rPr>
-        <w:t>ren, mit Ausrichter koordinieren, Verpflegungen (zb bei Jahreshauptversammlung) besprechen</w:t>
+        <w:t>ren, mit Ausrichter koordinieren, Verpflegungen (</w:t>
+      </w:r>
+      <w:proofErr w:type="spellStart"/>
+      <w:r>
+        <w:rPr>
+          <w:lang w:val="de-DE"/>
+        </w:rPr>
+        <w:t>zb</w:t>
+      </w:r>
+      <w:proofErr w:type="spellEnd"/>
+      <w:r>
+        <w:rPr>
+          <w:lang w:val="de-DE"/>
+        </w:rPr>
+        <w:t xml:space="preserve"> bei Jahreshauptversammlung) besprechen</w:t>
       </w:r>
     </w:p>
     <w:p>
@@ -729,8 +893,13 @@
         </w:rPr>
         <w:t>ü</w:t>
       </w:r>
-      <w:r>
-        <w:t>ttenwochenende plant das Jugendforum</w:t>
+      <w:proofErr w:type="spellStart"/>
+      <w:r>
+        <w:t>ttenwochenende</w:t>
+      </w:r>
+      <w:proofErr w:type="spellEnd"/>
+      <w:r>
+        <w:t xml:space="preserve"> plant das Jugendforum</w:t>
       </w:r>
     </w:p>
     <w:p>
@@ -811,7 +980,21 @@
         <w:rPr>
           <w:lang w:val="de-DE"/>
         </w:rPr>
-        <w:t>ums-Festakt, Ehrungsabenden,JHV o.</w:t>
+        <w:t xml:space="preserve">ums-Festakt, </w:t>
+      </w:r>
+      <w:proofErr w:type="spellStart"/>
+      <w:r>
+        <w:rPr>
+          <w:lang w:val="de-DE"/>
+        </w:rPr>
+        <w:t>Ehrungsabenden,JHV</w:t>
+      </w:r>
+      <w:proofErr w:type="spellEnd"/>
+      <w:r>
+        <w:rPr>
+          <w:lang w:val="de-DE"/>
+        </w:rPr>
+        <w:t xml:space="preserve"> o.</w:t>
       </w:r>
       <w:r>
         <w:rPr>
@@ -823,7 +1006,21 @@
         <w:rPr>
           <w:lang w:val="de-DE"/>
         </w:rPr>
-        <w:t xml:space="preserve">.) entweder selbst, Stellvertrter, Kreisehrungen können auch von Mitgliedern des Ausschusses </w:t>
+        <w:t xml:space="preserve">.) entweder selbst, </w:t>
+      </w:r>
+      <w:proofErr w:type="spellStart"/>
+      <w:r>
+        <w:rPr>
+          <w:lang w:val="de-DE"/>
+        </w:rPr>
+        <w:t>Stellvertrter</w:t>
+      </w:r>
+      <w:proofErr w:type="spellEnd"/>
+      <w:r>
+        <w:rPr>
+          <w:lang w:val="de-DE"/>
+        </w:rPr>
+        <w:t xml:space="preserve">, Kreisehrungen können auch von Mitgliedern des Ausschusses </w:t>
       </w:r>
       <w:r>
         <w:rPr>
@@ -838,7 +1035,39 @@
         <w:t xml:space="preserve">bernommen werden. </w:t>
       </w:r>
       <w:r>
-        <w:t>KFV der KBM geht auch (hier halt absprechen)</w:t>
+        <w:t xml:space="preserve">KFV der KBM </w:t>
+      </w:r>
+      <w:proofErr w:type="spellStart"/>
+      <w:r>
+        <w:t>geht</w:t>
+      </w:r>
+      <w:proofErr w:type="spellEnd"/>
+      <w:r>
+        <w:t xml:space="preserve"> </w:t>
+      </w:r>
+      <w:proofErr w:type="spellStart"/>
+      <w:r>
+        <w:t>auch</w:t>
+      </w:r>
+      <w:proofErr w:type="spellEnd"/>
+      <w:r>
+        <w:t xml:space="preserve"> (</w:t>
+      </w:r>
+      <w:proofErr w:type="spellStart"/>
+      <w:r>
+        <w:t>hier</w:t>
+      </w:r>
+      <w:proofErr w:type="spellEnd"/>
+      <w:r>
+        <w:t xml:space="preserve"> halt </w:t>
+      </w:r>
+      <w:proofErr w:type="spellStart"/>
+      <w:r>
+        <w:t>absprechen</w:t>
+      </w:r>
+      <w:proofErr w:type="spellEnd"/>
+      <w:r>
+        <w:t>)</w:t>
       </w:r>
     </w:p>
     <w:p>
@@ -877,10 +1106,54 @@
         <w:rPr>
           <w:lang w:val="de-DE"/>
         </w:rPr>
-        <w:t xml:space="preserve">ro zu beantragen, Forumular kann auf der HP heruntergeladenwerden. </w:t>
-      </w:r>
-      <w:r>
-        <w:t xml:space="preserve">Auch Ehrungen der DJF werden </w:t>
+        <w:t xml:space="preserve">ro zu beantragen, </w:t>
+      </w:r>
+      <w:proofErr w:type="spellStart"/>
+      <w:r>
+        <w:rPr>
+          <w:lang w:val="de-DE"/>
+        </w:rPr>
+        <w:t>Forumular</w:t>
+      </w:r>
+      <w:proofErr w:type="spellEnd"/>
+      <w:r>
+        <w:rPr>
+          <w:lang w:val="de-DE"/>
+        </w:rPr>
+        <w:t xml:space="preserve"> kann auf der HP </w:t>
+      </w:r>
+      <w:proofErr w:type="spellStart"/>
+      <w:r>
+        <w:rPr>
+          <w:lang w:val="de-DE"/>
+        </w:rPr>
+        <w:t>heruntergeladenwerden</w:t>
+      </w:r>
+      <w:proofErr w:type="spellEnd"/>
+      <w:r>
+        <w:rPr>
+          <w:lang w:val="de-DE"/>
+        </w:rPr>
+        <w:t xml:space="preserve">. </w:t>
+      </w:r>
+      <w:r>
+        <w:t xml:space="preserve">Auch </w:t>
+      </w:r>
+      <w:proofErr w:type="spellStart"/>
+      <w:r>
+        <w:t>Ehrungen</w:t>
+      </w:r>
+      <w:proofErr w:type="spellEnd"/>
+      <w:r>
+        <w:t xml:space="preserve"> der DJF </w:t>
+      </w:r>
+      <w:proofErr w:type="spellStart"/>
+      <w:r>
+        <w:t>werden</w:t>
+      </w:r>
+      <w:proofErr w:type="spellEnd"/>
+      <w:r>
+        <w:t xml:space="preserve"> </w:t>
       </w:r>
       <w:r>
         <w:rPr>
@@ -888,16 +1161,39 @@
         </w:rPr>
         <w:t>ü</w:t>
       </w:r>
-      <w:r>
-        <w:t xml:space="preserve">bers Land beantragt. </w:t>
+      <w:proofErr w:type="spellStart"/>
+      <w:r>
+        <w:t>bers</w:t>
+      </w:r>
+      <w:proofErr w:type="spellEnd"/>
+      <w:r>
+        <w:t xml:space="preserve"> Land </w:t>
+      </w:r>
+      <w:proofErr w:type="spellStart"/>
+      <w:r>
+        <w:t>beantragt</w:t>
+      </w:r>
+      <w:proofErr w:type="spellEnd"/>
+      <w:r>
+        <w:t xml:space="preserve">. </w:t>
       </w:r>
     </w:p>
     <w:p/>
     <w:p/>
     <w:p>
-      <w:r>
-        <w:t>Bereits bestehende</w:t>
-      </w:r>
+      <w:proofErr w:type="spellStart"/>
+      <w:r>
+        <w:t>Bereits</w:t>
+      </w:r>
+      <w:proofErr w:type="spellEnd"/>
+      <w:r>
+        <w:t xml:space="preserve"> </w:t>
+      </w:r>
+      <w:proofErr w:type="spellStart"/>
+      <w:r>
+        <w:t>bestehende</w:t>
+      </w:r>
+      <w:proofErr w:type="spellEnd"/>
       <w:r>
         <w:rPr>
           <w:lang w:val="de-DE"/>
@@ -1037,7 +1333,13 @@
         </w:numPr>
       </w:pPr>
       <w:r>
-        <w:t>5./6.5.2027</w:t>
+        <w:t>5./6.</w:t>
+      </w:r>
+      <w:r>
+        <w:t>0</w:t>
+      </w:r>
+      <w:r>
+        <w:t>5.2027</w:t>
       </w:r>
       <w:r>
         <w:tab/>
@@ -1049,9 +1351,11 @@
         </w:rPr>
         <w:t>ü</w:t>
       </w:r>
+      <w:proofErr w:type="spellStart"/>
       <w:r>
         <w:t>ttenwochenende</w:t>
       </w:r>
+      <w:proofErr w:type="spellEnd"/>
     </w:p>
     <w:p>
       <w:pPr>
@@ -1068,7 +1372,19 @@
         <w:rPr>
           <w:lang w:val="de-DE"/>
         </w:rPr>
-        <w:t>9.-11.7.</w:t>
+        <w:t>9.-11.</w:t>
+      </w:r>
+      <w:r>
+        <w:rPr>
+          <w:lang w:val="de-DE"/>
+        </w:rPr>
+        <w:t>0</w:t>
+      </w:r>
+      <w:r>
+        <w:rPr>
+          <w:lang w:val="de-DE"/>
+        </w:rPr>
+        <w:t>7.</w:t>
       </w:r>
       <w:r>
         <w:rPr>
@@ -1152,11 +1468,32 @@
           <w:ilvl w:val="0"/>
           <w:numId w:val="3"/>
         </w:numPr>
-      </w:pPr>
-      <w:r>
-        <w:t>18.9.2027</w:t>
-      </w:r>
-      <w:r>
+        <w:rPr>
+          <w:lang w:val="de-DE"/>
+        </w:rPr>
+      </w:pPr>
+      <w:r>
+        <w:rPr>
+          <w:lang w:val="de-DE"/>
+        </w:rPr>
+        <w:t>18.</w:t>
+      </w:r>
+      <w:r>
+        <w:rPr>
+          <w:lang w:val="de-DE"/>
+        </w:rPr>
+        <w:t>0</w:t>
+      </w:r>
+      <w:r>
+        <w:rPr>
+          <w:lang w:val="de-DE"/>
+        </w:rPr>
+        <w:t>9.2027</w:t>
+      </w:r>
+      <w:r>
+        <w:rPr>
+          <w:lang w:val="de-DE"/>
+        </w:rPr>
         <w:tab/>
         <w:t>Delegiertenversammlung JF BW im Bodenseekreis</w:t>
       </w:r>
@@ -1174,7 +1511,14 @@
       </w:r>
       <w:r>
         <w:tab/>
-        <w:t>Verbandsversammlung LFV in Ludwigsburg</w:t>
+      </w:r>
+      <w:proofErr w:type="spellStart"/>
+      <w:r>
+        <w:t>Verbandsversammlung</w:t>
+      </w:r>
+      <w:proofErr w:type="spellEnd"/>
+      <w:r>
+        <w:t xml:space="preserve"> LFV in Ludwigsburg</w:t>
       </w:r>
     </w:p>
     <w:p>
@@ -1190,8 +1534,12 @@
       </w:r>
       <w:r>
         <w:tab/>
+      </w:r>
+      <w:proofErr w:type="spellStart"/>
+      <w:r>
         <w:t>Jahresabschluss</w:t>
       </w:r>
+      <w:proofErr w:type="spellEnd"/>
     </w:p>
     <w:p>
       <w:pPr>
@@ -1253,11 +1601,19 @@
         </w:rPr>
         <w:tab/>
       </w:r>
-      <w:r>
-        <w:rPr>
-          <w:lang w:val="de-DE"/>
-        </w:rPr>
-        <w:t xml:space="preserve">Merchingen? </w:t>
+      <w:proofErr w:type="spellStart"/>
+      <w:r>
+        <w:rPr>
+          <w:lang w:val="de-DE"/>
+        </w:rPr>
+        <w:t>Merchingen</w:t>
+      </w:r>
+      <w:proofErr w:type="spellEnd"/>
+      <w:r>
+        <w:rPr>
+          <w:lang w:val="de-DE"/>
+        </w:rPr>
+        <w:t xml:space="preserve">? </w:t>
       </w:r>
       <w:r>
         <w:rPr>
@@ -1466,6 +1822,7 @@
 <file path=word/numbering.xml><?xml version="1.0" encoding="utf-8"?>
 <w:numbering xmlns:wpc="http://schemas.microsoft.com/office/word/2010/wordprocessingCanvas" xmlns:cx="http://schemas.microsoft.com/office/drawing/2014/chartex" xmlns:cx1="http://schemas.microsoft.com/office/drawing/2015/9/8/chartex" xmlns:cx2="http://schemas.microsoft.com/office/drawing/2015/10/21/chartex" xmlns:cx3="http://schemas.microsoft.com/office/drawing/2016/5/9/chartex" xmlns:cx4="http://schemas.microsoft.com/office/drawing/2016/5/10/chartex" xmlns:cx5="http://schemas.microsoft.com/office/drawing/2016/5/11/chartex" xmlns:cx6="http://schemas.microsoft.com/office/drawing/2016/5/12/chartex" xmlns:cx7="http://schemas.microsoft.com/office/drawing/2016/5/13/chartex" xmlns:cx8="http://schemas.microsoft.com/office/drawing/2016/5/14/chartex" xmlns:mc="http://schemas.openxmlformats.org/markup-compatibility/2006" xmlns:aink="http://schemas.microsoft.com/office/drawing/2016/ink" xmlns:am3d="http://schemas.microsoft.com/office/drawing/2017/model3d" xmlns:o="urn:schemas-microsoft-com:office:office" xmlns:oel="http://schemas.microsoft.com/office/2019/extlst" xmlns:r="http://schemas.openxmlformats.org/officeDocument/2006/relationships" xmlns:m="http://schemas.openxmlformats.org/officeDocument/2006/math" xmlns:v="urn:schemas-microsoft-com:vml" xmlns:wp14="http://schemas.microsoft.com/office/word/2010/wordprocessingDrawing" xmlns:wp="http://schemas.openxmlformats.org/drawingml/2006/wordprocessingDrawing" xmlns:w10="urn:schemas-microsoft-com:office:word" xmlns:w="http://schemas.openxmlformats.org/wordprocessingml/2006/main" xmlns:w14="http://schemas.microsoft.com/office/word/2010/wordml" xmlns:w15="http://schemas.microsoft.com/office/word/2012/wordml" xmlns:w16cex="http://schemas.microsoft.com/office/word/2018/wordml/cex" xmlns:w16cid="http://schemas.microsoft.com/office/word/2016/wordml/cid" xmlns:w16="http://schemas.microsoft.com/office/word/2018/wordml" xmlns:w16du="http://schemas.microsoft.com/office/word/2023/wordml/word16du" xmlns:w16sdtdh="http://schemas.microsoft.com/office/word/2020/wordml/sdtdatahash" xmlns:w16sdtfl="http://schemas.microsoft.com/office/word/2024/wordml/sdtformatlock" xmlns:w16se="http://schemas.microsoft.com/office/word/2015/wordml/symex" xmlns:wpg="http://schemas.microsoft.com/office/word/2010/wordprocessingGroup" xmlns:wpi="http://schemas.microsoft.com/office/word/2010/wordprocessingInk" xmlns:wne="http://schemas.microsoft.com/office/word/2006/wordml" xmlns:wps="http://schemas.microsoft.com/office/word/2010/wordprocessingShape" mc:Ignorable="w14 w15 w16se w16cid w16 w16cex w16sdtdh w16sdtfl w16du wp14">
   <w:abstractNum w:abstractNumId="0" w15:restartNumberingAfterBreak="0">
+    <w:nsid w:val="00000001"/>
     <w:multiLevelType w:val="hybridMultilevel"/>
     <w:tmpl w:val="00000000"/>
     <w:lvl w:ilvl="0" w:tplc="04090001">
@@ -1578,7 +1935,120 @@
     </w:lvl>
   </w:abstractNum>
   <w:abstractNum w:abstractNumId="1" w15:restartNumberingAfterBreak="0">
-    <w:nsid w:val="00000001"/>
+    <w:nsid w:val="00000002"/>
+    <w:multiLevelType w:val="hybridMultilevel"/>
+    <w:tmpl w:val="00000000"/>
+    <w:lvl w:ilvl="0" w:tplc="04090001">
+      <w:start w:val="1"/>
+      <w:numFmt w:val="bullet"/>
+      <w:lvlText w:val=""/>
+      <w:lvlJc w:val="left"/>
+      <w:pPr>
+        <w:ind w:left="720" w:hanging="360"/>
+      </w:pPr>
+      <w:rPr>
+        <w:rFonts w:ascii="Symbol" w:hAnsi="Symbol" w:hint="default"/>
+      </w:rPr>
+    </w:lvl>
+    <w:lvl w:ilvl="1" w:tplc="04090003">
+      <w:start w:val="1"/>
+      <w:numFmt w:val="bullet"/>
+      <w:lvlText w:val="o"/>
+      <w:lvlJc w:val="left"/>
+      <w:pPr>
+        <w:ind w:left="1440" w:hanging="360"/>
+      </w:pPr>
+      <w:rPr>
+        <w:rFonts w:ascii="Courier New" w:hAnsi="Courier New" w:cs="Courier New" w:hint="default"/>
+      </w:rPr>
+    </w:lvl>
+    <w:lvl w:ilvl="2" w:tplc="04090005">
+      <w:start w:val="1"/>
+      <w:numFmt w:val="bullet"/>
+      <w:lvlText w:val=""/>
+      <w:lvlJc w:val="left"/>
+      <w:pPr>
+        <w:ind w:left="2160" w:hanging="360"/>
+      </w:pPr>
+      <w:rPr>
+        <w:rFonts w:ascii="Wingdings" w:hAnsi="Wingdings" w:hint="default"/>
+      </w:rPr>
+    </w:lvl>
+    <w:lvl w:ilvl="3" w:tplc="04090001" w:tentative="1">
+      <w:start w:val="1"/>
+      <w:numFmt w:val="bullet"/>
+      <w:lvlText w:val=""/>
+      <w:lvlJc w:val="left"/>
+      <w:pPr>
+        <w:ind w:left="2880" w:hanging="360"/>
+      </w:pPr>
+      <w:rPr>
+        <w:rFonts w:ascii="Symbol" w:hAnsi="Symbol" w:hint="default"/>
+      </w:rPr>
+    </w:lvl>
+    <w:lvl w:ilvl="4" w:tplc="04090003" w:tentative="1">
+      <w:start w:val="1"/>
+      <w:numFmt w:val="bullet"/>
+      <w:lvlText w:val="o"/>
+      <w:lvlJc w:val="left"/>
+      <w:pPr>
+        <w:ind w:left="3600" w:hanging="360"/>
+      </w:pPr>
+      <w:rPr>
+        <w:rFonts w:ascii="Courier New" w:hAnsi="Courier New" w:cs="Courier New" w:hint="default"/>
+      </w:rPr>
+    </w:lvl>
+    <w:lvl w:ilvl="5" w:tplc="04090005" w:tentative="1">
+      <w:start w:val="1"/>
+      <w:numFmt w:val="bullet"/>
+      <w:lvlText w:val=""/>
+      <w:lvlJc w:val="left"/>
+      <w:pPr>
+        <w:ind w:left="4320" w:hanging="360"/>
+      </w:pPr>
+      <w:rPr>
+        <w:rFonts w:ascii="Wingdings" w:hAnsi="Wingdings" w:hint="default"/>
+      </w:rPr>
+    </w:lvl>
+    <w:lvl w:ilvl="6" w:tplc="04090001" w:tentative="1">
+      <w:start w:val="1"/>
+      <w:numFmt w:val="bullet"/>
+      <w:lvlText w:val=""/>
+      <w:lvlJc w:val="left"/>
+      <w:pPr>
+        <w:ind w:left="5040" w:hanging="360"/>
+      </w:pPr>
+      <w:rPr>
+        <w:rFonts w:ascii="Symbol" w:hAnsi="Symbol" w:hint="default"/>
+      </w:rPr>
+    </w:lvl>
+    <w:lvl w:ilvl="7" w:tplc="04090003" w:tentative="1">
+      <w:start w:val="1"/>
+      <w:numFmt w:val="bullet"/>
+      <w:lvlText w:val="o"/>
+      <w:lvlJc w:val="left"/>
+      <w:pPr>
+        <w:ind w:left="5760" w:hanging="360"/>
+      </w:pPr>
+      <w:rPr>
+        <w:rFonts w:ascii="Courier New" w:hAnsi="Courier New" w:cs="Courier New" w:hint="default"/>
+      </w:rPr>
+    </w:lvl>
+    <w:lvl w:ilvl="8" w:tplc="04090005" w:tentative="1">
+      <w:start w:val="1"/>
+      <w:numFmt w:val="bullet"/>
+      <w:lvlText w:val=""/>
+      <w:lvlJc w:val="left"/>
+      <w:pPr>
+        <w:ind w:left="6480" w:hanging="360"/>
+      </w:pPr>
+      <w:rPr>
+        <w:rFonts w:ascii="Wingdings" w:hAnsi="Wingdings" w:hint="default"/>
+      </w:rPr>
+    </w:lvl>
+  </w:abstractNum>
+  <w:abstractNum w:abstractNumId="2" w15:restartNumberingAfterBreak="0">
+    <w:nsid w:val="3A6E4E3C"/>
     <w:multiLevelType w:val="hybridMultilevel"/>
     <w:tmpl w:val="00000000"/>
     <w:lvl w:ilvl="0" w:tplc="04090001">
@@ -1690,127 +2160,14 @@
       </w:rPr>
     </w:lvl>
   </w:abstractNum>
-  <w:abstractNum w:abstractNumId="2" w15:restartNumberingAfterBreak="0">
-    <w:nsid w:val="00000002"/>
-    <w:multiLevelType w:val="hybridMultilevel"/>
-    <w:tmpl w:val="00000000"/>
-    <w:lvl w:ilvl="0" w:tplc="04090001">
-      <w:start w:val="1"/>
-      <w:numFmt w:val="bullet"/>
-      <w:lvlText w:val=""/>
-      <w:lvlJc w:val="left"/>
-      <w:pPr>
-        <w:ind w:left="720" w:hanging="360"/>
-      </w:pPr>
-      <w:rPr>
-        <w:rFonts w:ascii="Symbol" w:hAnsi="Symbol" w:hint="default"/>
-      </w:rPr>
-    </w:lvl>
-    <w:lvl w:ilvl="1" w:tplc="04090003">
-      <w:start w:val="1"/>
-      <w:numFmt w:val="bullet"/>
-      <w:lvlText w:val="o"/>
-      <w:lvlJc w:val="left"/>
-      <w:pPr>
-        <w:ind w:left="1440" w:hanging="360"/>
-      </w:pPr>
-      <w:rPr>
-        <w:rFonts w:ascii="Courier New" w:hAnsi="Courier New" w:cs="Courier New" w:hint="default"/>
-      </w:rPr>
-    </w:lvl>
-    <w:lvl w:ilvl="2" w:tplc="04090005">
-      <w:start w:val="1"/>
-      <w:numFmt w:val="bullet"/>
-      <w:lvlText w:val=""/>
-      <w:lvlJc w:val="left"/>
-      <w:pPr>
-        <w:ind w:left="2160" w:hanging="360"/>
-      </w:pPr>
-      <w:rPr>
-        <w:rFonts w:ascii="Wingdings" w:hAnsi="Wingdings" w:hint="default"/>
-      </w:rPr>
-    </w:lvl>
-    <w:lvl w:ilvl="3" w:tplc="04090001" w:tentative="1">
-      <w:start w:val="1"/>
-      <w:numFmt w:val="bullet"/>
-      <w:lvlText w:val=""/>
-      <w:lvlJc w:val="left"/>
-      <w:pPr>
-        <w:ind w:left="2880" w:hanging="360"/>
-      </w:pPr>
-      <w:rPr>
-        <w:rFonts w:ascii="Symbol" w:hAnsi="Symbol" w:hint="default"/>
-      </w:rPr>
-    </w:lvl>
-    <w:lvl w:ilvl="4" w:tplc="04090003" w:tentative="1">
-      <w:start w:val="1"/>
-      <w:numFmt w:val="bullet"/>
-      <w:lvlText w:val="o"/>
-      <w:lvlJc w:val="left"/>
-      <w:pPr>
-        <w:ind w:left="3600" w:hanging="360"/>
-      </w:pPr>
-      <w:rPr>
-        <w:rFonts w:ascii="Courier New" w:hAnsi="Courier New" w:cs="Courier New" w:hint="default"/>
-      </w:rPr>
-    </w:lvl>
-    <w:lvl w:ilvl="5" w:tplc="04090005" w:tentative="1">
-      <w:start w:val="1"/>
-      <w:numFmt w:val="bullet"/>
-      <w:lvlText w:val=""/>
-      <w:lvlJc w:val="left"/>
-      <w:pPr>
-        <w:ind w:left="4320" w:hanging="360"/>
-      </w:pPr>
-      <w:rPr>
-        <w:rFonts w:ascii="Wingdings" w:hAnsi="Wingdings" w:hint="default"/>
-      </w:rPr>
-    </w:lvl>
-    <w:lvl w:ilvl="6" w:tplc="04090001" w:tentative="1">
-      <w:start w:val="1"/>
-      <w:numFmt w:val="bullet"/>
-      <w:lvlText w:val=""/>
-      <w:lvlJc w:val="left"/>
-      <w:pPr>
-        <w:ind w:left="5040" w:hanging="360"/>
-      </w:pPr>
-      <w:rPr>
-        <w:rFonts w:ascii="Symbol" w:hAnsi="Symbol" w:hint="default"/>
-      </w:rPr>
-    </w:lvl>
-    <w:lvl w:ilvl="7" w:tplc="04090003" w:tentative="1">
-      <w:start w:val="1"/>
-      <w:numFmt w:val="bullet"/>
-      <w:lvlText w:val="o"/>
-      <w:lvlJc w:val="left"/>
-      <w:pPr>
-        <w:ind w:left="5760" w:hanging="360"/>
-      </w:pPr>
-      <w:rPr>
-        <w:rFonts w:ascii="Courier New" w:hAnsi="Courier New" w:cs="Courier New" w:hint="default"/>
-      </w:rPr>
-    </w:lvl>
-    <w:lvl w:ilvl="8" w:tplc="04090005" w:tentative="1">
-      <w:start w:val="1"/>
-      <w:numFmt w:val="bullet"/>
-      <w:lvlText w:val=""/>
-      <w:lvlJc w:val="left"/>
-      <w:pPr>
-        <w:ind w:left="6480" w:hanging="360"/>
-      </w:pPr>
-      <w:rPr>
-        <w:rFonts w:ascii="Wingdings" w:hAnsi="Wingdings" w:hint="default"/>
-      </w:rPr>
-    </w:lvl>
-  </w:abstractNum>
   <w:num w:numId="1" w16cid:durableId="561792825">
+    <w:abstractNumId w:val="2"/>
+  </w:num>
+  <w:num w:numId="2" w16cid:durableId="2134596336">
     <w:abstractNumId w:val="0"/>
   </w:num>
-  <w:num w:numId="2" w16cid:durableId="2134596336">
+  <w:num w:numId="3" w16cid:durableId="1776293110">
     <w:abstractNumId w:val="1"/>
-  </w:num>
-  <w:num w:numId="3" w16cid:durableId="1776293110">
-    <w:abstractNumId w:val="2"/>
   </w:num>
 </w:numbering>
 </file>

</xml_diff>